<commit_message>
fix(report): fix XML structure in Table of Contents to allow Microsoft Word to open cleanly without errors
</commit_message>
<xml_diff>
--- a/docs/BAO_CAO_DO_AN_HUIT.docx
+++ b/docs/BAO_CAO_DO_AN_HUIT.docx
@@ -2883,6 +2883,2399 @@
           <w:sz w:val="32"/>
         </w:rPr>
         <w:t>MỤC LỤC</w:t>
+      </w:r>
+    </w:p>
+    <w:p>
+      <w:pPr>
+        <w:spacing w:before="40" w:after="40" w:line="276" w:lineRule="auto"/>
+        <w:tabs>
+          <w:tab w:val="right" w:leader="dot" w:pos="9070"/>
+        </w:tabs>
+      </w:pPr>
+      <w:r>
+        <w:rPr>
+          <w:rFonts w:ascii="Times New Roman" w:hAnsi="Times New Roman"/>
+          <w:b/>
+          <w:color w:val="1E1E1E"/>
+          <w:sz w:val="23"/>
+        </w:rPr>
+        <w:t>LỜI CAM ĐOAN</w:t>
+      </w:r>
+      <w:r>
+        <w:rPr>
+          <w:rFonts w:ascii="Times New Roman" w:hAnsi="Times New Roman"/>
+        </w:rPr>
+        <w:tab/>
+      </w:r>
+      <w:r>
+        <w:rPr>
+          <w:rFonts w:ascii="Times New Roman" w:hAnsi="Times New Roman"/>
+          <w:b/>
+          <w:color w:val="1E1E1E"/>
+          <w:sz w:val="23"/>
+        </w:rPr>
+        <w:t>i</w:t>
+      </w:r>
+    </w:p>
+    <w:p>
+      <w:pPr>
+        <w:spacing w:before="40" w:after="40" w:line="276" w:lineRule="auto"/>
+        <w:tabs>
+          <w:tab w:val="right" w:leader="dot" w:pos="9070"/>
+        </w:tabs>
+      </w:pPr>
+      <w:r>
+        <w:rPr>
+          <w:rFonts w:ascii="Times New Roman" w:hAnsi="Times New Roman"/>
+          <w:b/>
+          <w:color w:val="1E1E1E"/>
+          <w:sz w:val="23"/>
+        </w:rPr>
+        <w:t>LỜI CẢM ƠN</w:t>
+      </w:r>
+      <w:r>
+        <w:rPr>
+          <w:rFonts w:ascii="Times New Roman" w:hAnsi="Times New Roman"/>
+        </w:rPr>
+        <w:tab/>
+      </w:r>
+      <w:r>
+        <w:rPr>
+          <w:rFonts w:ascii="Times New Roman" w:hAnsi="Times New Roman"/>
+          <w:b/>
+          <w:color w:val="1E1E1E"/>
+          <w:sz w:val="23"/>
+        </w:rPr>
+        <w:t>ii</w:t>
+      </w:r>
+    </w:p>
+    <w:p>
+      <w:pPr>
+        <w:spacing w:before="40" w:after="40" w:line="276" w:lineRule="auto"/>
+        <w:tabs>
+          <w:tab w:val="right" w:leader="dot" w:pos="9070"/>
+        </w:tabs>
+      </w:pPr>
+      <w:r>
+        <w:rPr>
+          <w:rFonts w:ascii="Times New Roman" w:hAnsi="Times New Roman"/>
+          <w:b/>
+          <w:color w:val="1E1E1E"/>
+          <w:sz w:val="23"/>
+        </w:rPr>
+        <w:t>NHẬN XÉT CỦA GIẢNG VIÊN HƯỚNG DẪN</w:t>
+      </w:r>
+      <w:r>
+        <w:rPr>
+          <w:rFonts w:ascii="Times New Roman" w:hAnsi="Times New Roman"/>
+        </w:rPr>
+        <w:tab/>
+      </w:r>
+      <w:r>
+        <w:rPr>
+          <w:rFonts w:ascii="Times New Roman" w:hAnsi="Times New Roman"/>
+          <w:b/>
+          <w:color w:val="1E1E1E"/>
+          <w:sz w:val="23"/>
+        </w:rPr>
+        <w:t>iii</w:t>
+      </w:r>
+    </w:p>
+    <w:p>
+      <w:pPr>
+        <w:spacing w:before="40" w:after="40" w:line="276" w:lineRule="auto"/>
+        <w:tabs>
+          <w:tab w:val="right" w:leader="dot" w:pos="9070"/>
+        </w:tabs>
+      </w:pPr>
+      <w:r>
+        <w:rPr>
+          <w:rFonts w:ascii="Times New Roman" w:hAnsi="Times New Roman"/>
+          <w:b/>
+          <w:color w:val="1E1E1E"/>
+          <w:sz w:val="23"/>
+        </w:rPr>
+        <w:t>BẢNG PHÂN CÔNG CÔNG VIỆC VÀ ĐÓNG GÓP THÀNH VIÊN</w:t>
+      </w:r>
+      <w:r>
+        <w:rPr>
+          <w:rFonts w:ascii="Times New Roman" w:hAnsi="Times New Roman"/>
+        </w:rPr>
+        <w:tab/>
+      </w:r>
+      <w:r>
+        <w:rPr>
+          <w:rFonts w:ascii="Times New Roman" w:hAnsi="Times New Roman"/>
+          <w:b/>
+          <w:color w:val="1E1E1E"/>
+          <w:sz w:val="23"/>
+        </w:rPr>
+        <w:t>iv</w:t>
+      </w:r>
+    </w:p>
+    <w:p>
+      <w:pPr>
+        <w:spacing w:before="40" w:after="40" w:line="276" w:lineRule="auto"/>
+        <w:tabs>
+          <w:tab w:val="right" w:leader="dot" w:pos="9070"/>
+        </w:tabs>
+      </w:pPr>
+      <w:r>
+        <w:rPr>
+          <w:rFonts w:ascii="Times New Roman" w:hAnsi="Times New Roman"/>
+          <w:b/>
+          <w:color w:val="1E1E1E"/>
+          <w:sz w:val="23"/>
+        </w:rPr>
+        <w:t>TÓM TẮT ĐỀ TÀI / ABSTRACT</w:t>
+      </w:r>
+      <w:r>
+        <w:rPr>
+          <w:rFonts w:ascii="Times New Roman" w:hAnsi="Times New Roman"/>
+        </w:rPr>
+        <w:tab/>
+      </w:r>
+      <w:r>
+        <w:rPr>
+          <w:rFonts w:ascii="Times New Roman" w:hAnsi="Times New Roman"/>
+          <w:b/>
+          <w:color w:val="1E1E1E"/>
+          <w:sz w:val="23"/>
+        </w:rPr>
+        <w:t>v</w:t>
+      </w:r>
+    </w:p>
+    <w:p>
+      <w:pPr>
+        <w:spacing w:before="40" w:after="40" w:line="276" w:lineRule="auto"/>
+        <w:tabs>
+          <w:tab w:val="right" w:leader="dot" w:pos="9070"/>
+        </w:tabs>
+      </w:pPr>
+      <w:r>
+        <w:rPr>
+          <w:rFonts w:ascii="Times New Roman" w:hAnsi="Times New Roman"/>
+          <w:b/>
+          <w:color w:val="1E1E1E"/>
+          <w:sz w:val="23"/>
+        </w:rPr>
+        <w:t>DANH MỤC THUẬT NGỮ VÀ TỪ VIẾT TẮT</w:t>
+      </w:r>
+      <w:r>
+        <w:rPr>
+          <w:rFonts w:ascii="Times New Roman" w:hAnsi="Times New Roman"/>
+        </w:rPr>
+        <w:tab/>
+      </w:r>
+      <w:r>
+        <w:rPr>
+          <w:rFonts w:ascii="Times New Roman" w:hAnsi="Times New Roman"/>
+          <w:b/>
+          <w:color w:val="1E1E1E"/>
+          <w:sz w:val="23"/>
+        </w:rPr>
+        <w:t>vii</w:t>
+      </w:r>
+    </w:p>
+    <w:p>
+      <w:pPr>
+        <w:spacing w:before="40" w:after="40" w:line="276" w:lineRule="auto"/>
+        <w:tabs>
+          <w:tab w:val="right" w:leader="dot" w:pos="9070"/>
+        </w:tabs>
+      </w:pPr>
+      <w:r>
+        <w:rPr>
+          <w:rFonts w:ascii="Times New Roman" w:hAnsi="Times New Roman"/>
+          <w:b/>
+          <w:color w:val="1E1E1E"/>
+          <w:sz w:val="23"/>
+        </w:rPr>
+        <w:t>DANH MỤC HÌNH ẢNH</w:t>
+      </w:r>
+      <w:r>
+        <w:rPr>
+          <w:rFonts w:ascii="Times New Roman" w:hAnsi="Times New Roman"/>
+        </w:rPr>
+        <w:tab/>
+      </w:r>
+      <w:r>
+        <w:rPr>
+          <w:rFonts w:ascii="Times New Roman" w:hAnsi="Times New Roman"/>
+          <w:b/>
+          <w:color w:val="1E1E1E"/>
+          <w:sz w:val="23"/>
+        </w:rPr>
+        <w:t>viii</w:t>
+      </w:r>
+    </w:p>
+    <w:p>
+      <w:pPr>
+        <w:spacing w:before="40" w:after="40" w:line="276" w:lineRule="auto"/>
+        <w:tabs>
+          <w:tab w:val="right" w:leader="dot" w:pos="9070"/>
+        </w:tabs>
+      </w:pPr>
+      <w:r>
+        <w:rPr>
+          <w:rFonts w:ascii="Times New Roman" w:hAnsi="Times New Roman"/>
+          <w:b/>
+          <w:color w:val="1E1E1E"/>
+          <w:sz w:val="23"/>
+        </w:rPr>
+        <w:t>DANH MỤC BẢNG BIỂU</w:t>
+      </w:r>
+      <w:r>
+        <w:rPr>
+          <w:rFonts w:ascii="Times New Roman" w:hAnsi="Times New Roman"/>
+        </w:rPr>
+        <w:tab/>
+      </w:r>
+      <w:r>
+        <w:rPr>
+          <w:rFonts w:ascii="Times New Roman" w:hAnsi="Times New Roman"/>
+          <w:b/>
+          <w:color w:val="1E1E1E"/>
+          <w:sz w:val="23"/>
+        </w:rPr>
+        <w:t>ix</w:t>
+      </w:r>
+    </w:p>
+    <w:p>
+      <w:pPr>
+        <w:spacing w:before="40" w:after="40" w:line="276" w:lineRule="auto"/>
+        <w:tabs>
+          <w:tab w:val="right" w:leader="dot" w:pos="9070"/>
+        </w:tabs>
+      </w:pPr>
+      <w:r>
+        <w:rPr>
+          <w:rFonts w:ascii="Times New Roman" w:hAnsi="Times New Roman"/>
+          <w:b/>
+          <w:color w:val="1E1E1E"/>
+          <w:sz w:val="23"/>
+        </w:rPr>
+        <w:t>CHƯƠNG 1: MỞ ĐẦU</w:t>
+      </w:r>
+      <w:r>
+        <w:rPr>
+          <w:rFonts w:ascii="Times New Roman" w:hAnsi="Times New Roman"/>
+        </w:rPr>
+        <w:tab/>
+      </w:r>
+      <w:r>
+        <w:rPr>
+          <w:rFonts w:ascii="Times New Roman" w:hAnsi="Times New Roman"/>
+          <w:b/>
+          <w:color w:val="1E1E1E"/>
+          <w:sz w:val="23"/>
+        </w:rPr>
+        <w:t>1</w:t>
+      </w:r>
+    </w:p>
+    <w:p>
+      <w:pPr>
+        <w:spacing w:before="40" w:after="40" w:line="276" w:lineRule="auto"/>
+        <w:tabs>
+          <w:tab w:val="right" w:leader="dot" w:pos="9070"/>
+        </w:tabs>
+        <w:ind w:left="360"/>
+      </w:pPr>
+      <w:r>
+        <w:rPr>
+          <w:rFonts w:ascii="Times New Roman" w:hAnsi="Times New Roman"/>
+          <w:b w:val="0"/>
+          <w:color w:val="1E1E1E"/>
+          <w:sz w:val="23"/>
+        </w:rPr>
+        <w:t>1.1. Bối cảnh và Tính cấp thiết của đề tài</w:t>
+      </w:r>
+      <w:r>
+        <w:rPr>
+          <w:rFonts w:ascii="Times New Roman" w:hAnsi="Times New Roman"/>
+        </w:rPr>
+        <w:tab/>
+      </w:r>
+      <w:r>
+        <w:rPr>
+          <w:rFonts w:ascii="Times New Roman" w:hAnsi="Times New Roman"/>
+          <w:b w:val="0"/>
+          <w:color w:val="1E1E1E"/>
+          <w:sz w:val="23"/>
+        </w:rPr>
+        <w:t>1</w:t>
+      </w:r>
+    </w:p>
+    <w:p>
+      <w:pPr>
+        <w:spacing w:before="40" w:after="40" w:line="276" w:lineRule="auto"/>
+        <w:tabs>
+          <w:tab w:val="right" w:leader="dot" w:pos="9070"/>
+        </w:tabs>
+        <w:ind w:left="360"/>
+      </w:pPr>
+      <w:r>
+        <w:rPr>
+          <w:rFonts w:ascii="Times New Roman" w:hAnsi="Times New Roman"/>
+          <w:b w:val="0"/>
+          <w:color w:val="1E1E1E"/>
+          <w:sz w:val="23"/>
+        </w:rPr>
+        <w:t>1.2. Phân định bản chất khoa học: Phát hiện tin giả vs. Kiểm chứng thông tin</w:t>
+      </w:r>
+      <w:r>
+        <w:rPr>
+          <w:rFonts w:ascii="Times New Roman" w:hAnsi="Times New Roman"/>
+        </w:rPr>
+        <w:tab/>
+      </w:r>
+      <w:r>
+        <w:rPr>
+          <w:rFonts w:ascii="Times New Roman" w:hAnsi="Times New Roman"/>
+          <w:b w:val="0"/>
+          <w:color w:val="1E1E1E"/>
+          <w:sz w:val="23"/>
+        </w:rPr>
+        <w:t>2</w:t>
+      </w:r>
+    </w:p>
+    <w:p>
+      <w:pPr>
+        <w:spacing w:before="40" w:after="40" w:line="276" w:lineRule="auto"/>
+        <w:tabs>
+          <w:tab w:val="right" w:leader="dot" w:pos="9070"/>
+        </w:tabs>
+        <w:ind w:left="360"/>
+      </w:pPr>
+      <w:r>
+        <w:rPr>
+          <w:rFonts w:ascii="Times New Roman" w:hAnsi="Times New Roman"/>
+          <w:b w:val="0"/>
+          <w:color w:val="1E1E1E"/>
+          <w:sz w:val="23"/>
+        </w:rPr>
+        <w:t>1.3. Mục tiêu nghiên cứu</w:t>
+      </w:r>
+      <w:r>
+        <w:rPr>
+          <w:rFonts w:ascii="Times New Roman" w:hAnsi="Times New Roman"/>
+        </w:rPr>
+        <w:tab/>
+      </w:r>
+      <w:r>
+        <w:rPr>
+          <w:rFonts w:ascii="Times New Roman" w:hAnsi="Times New Roman"/>
+          <w:b w:val="0"/>
+          <w:color w:val="1E1E1E"/>
+          <w:sz w:val="23"/>
+        </w:rPr>
+        <w:t>3</w:t>
+      </w:r>
+    </w:p>
+    <w:p>
+      <w:pPr>
+        <w:spacing w:before="40" w:after="40" w:line="276" w:lineRule="auto"/>
+        <w:tabs>
+          <w:tab w:val="right" w:leader="dot" w:pos="9070"/>
+        </w:tabs>
+        <w:ind w:left="720"/>
+      </w:pPr>
+      <w:r>
+        <w:rPr>
+          <w:rFonts w:ascii="Times New Roman" w:hAnsi="Times New Roman"/>
+          <w:b w:val="0"/>
+          <w:color w:val="1E1E1E"/>
+          <w:sz w:val="23"/>
+        </w:rPr>
+        <w:t>1.3.1. Mục tiêu khoa học</w:t>
+      </w:r>
+      <w:r>
+        <w:rPr>
+          <w:rFonts w:ascii="Times New Roman" w:hAnsi="Times New Roman"/>
+        </w:rPr>
+        <w:tab/>
+      </w:r>
+      <w:r>
+        <w:rPr>
+          <w:rFonts w:ascii="Times New Roman" w:hAnsi="Times New Roman"/>
+          <w:b w:val="0"/>
+          <w:color w:val="1E1E1E"/>
+          <w:sz w:val="23"/>
+        </w:rPr>
+        <w:t>3</w:t>
+      </w:r>
+    </w:p>
+    <w:p>
+      <w:pPr>
+        <w:spacing w:before="40" w:after="40" w:line="276" w:lineRule="auto"/>
+        <w:tabs>
+          <w:tab w:val="right" w:leader="dot" w:pos="9070"/>
+        </w:tabs>
+        <w:ind w:left="720"/>
+      </w:pPr>
+      <w:r>
+        <w:rPr>
+          <w:rFonts w:ascii="Times New Roman" w:hAnsi="Times New Roman"/>
+          <w:b w:val="0"/>
+          <w:color w:val="1E1E1E"/>
+          <w:sz w:val="23"/>
+        </w:rPr>
+        <w:t>1.3.2. Mục tiêu thực tiễn</w:t>
+      </w:r>
+      <w:r>
+        <w:rPr>
+          <w:rFonts w:ascii="Times New Roman" w:hAnsi="Times New Roman"/>
+        </w:rPr>
+        <w:tab/>
+      </w:r>
+      <w:r>
+        <w:rPr>
+          <w:rFonts w:ascii="Times New Roman" w:hAnsi="Times New Roman"/>
+          <w:b w:val="0"/>
+          <w:color w:val="1E1E1E"/>
+          <w:sz w:val="23"/>
+        </w:rPr>
+        <w:t>4</w:t>
+      </w:r>
+    </w:p>
+    <w:p>
+      <w:pPr>
+        <w:spacing w:before="40" w:after="40" w:line="276" w:lineRule="auto"/>
+        <w:tabs>
+          <w:tab w:val="right" w:leader="dot" w:pos="9070"/>
+        </w:tabs>
+        <w:ind w:left="360"/>
+      </w:pPr>
+      <w:r>
+        <w:rPr>
+          <w:rFonts w:ascii="Times New Roman" w:hAnsi="Times New Roman"/>
+          <w:b w:val="0"/>
+          <w:color w:val="1E1E1E"/>
+          <w:sz w:val="23"/>
+        </w:rPr>
+        <w:t>1.4. Đối tượng và Phạm vi nghiên cứu</w:t>
+      </w:r>
+      <w:r>
+        <w:rPr>
+          <w:rFonts w:ascii="Times New Roman" w:hAnsi="Times New Roman"/>
+        </w:rPr>
+        <w:tab/>
+      </w:r>
+      <w:r>
+        <w:rPr>
+          <w:rFonts w:ascii="Times New Roman" w:hAnsi="Times New Roman"/>
+          <w:b w:val="0"/>
+          <w:color w:val="1E1E1E"/>
+          <w:sz w:val="23"/>
+        </w:rPr>
+        <w:t>4</w:t>
+      </w:r>
+    </w:p>
+    <w:p>
+      <w:pPr>
+        <w:spacing w:before="40" w:after="40" w:line="276" w:lineRule="auto"/>
+        <w:tabs>
+          <w:tab w:val="right" w:leader="dot" w:pos="9070"/>
+        </w:tabs>
+        <w:ind w:left="360"/>
+      </w:pPr>
+      <w:r>
+        <w:rPr>
+          <w:rFonts w:ascii="Times New Roman" w:hAnsi="Times New Roman"/>
+          <w:b w:val="0"/>
+          <w:color w:val="1E1E1E"/>
+          <w:sz w:val="23"/>
+        </w:rPr>
+        <w:t>1.5. Đóng góp chính của đề tài</w:t>
+      </w:r>
+      <w:r>
+        <w:rPr>
+          <w:rFonts w:ascii="Times New Roman" w:hAnsi="Times New Roman"/>
+        </w:rPr>
+        <w:tab/>
+      </w:r>
+      <w:r>
+        <w:rPr>
+          <w:rFonts w:ascii="Times New Roman" w:hAnsi="Times New Roman"/>
+          <w:b w:val="0"/>
+          <w:color w:val="1E1E1E"/>
+          <w:sz w:val="23"/>
+        </w:rPr>
+        <w:t>4</w:t>
+      </w:r>
+    </w:p>
+    <w:p>
+      <w:pPr>
+        <w:spacing w:before="40" w:after="40" w:line="276" w:lineRule="auto"/>
+        <w:tabs>
+          <w:tab w:val="right" w:leader="dot" w:pos="9070"/>
+        </w:tabs>
+        <w:ind w:left="360"/>
+      </w:pPr>
+      <w:r>
+        <w:rPr>
+          <w:rFonts w:ascii="Times New Roman" w:hAnsi="Times New Roman"/>
+          <w:b w:val="0"/>
+          <w:color w:val="1E1E1E"/>
+          <w:sz w:val="23"/>
+        </w:rPr>
+        <w:t>1.6. Bố cục của báo cáo đồ án</w:t>
+      </w:r>
+      <w:r>
+        <w:rPr>
+          <w:rFonts w:ascii="Times New Roman" w:hAnsi="Times New Roman"/>
+        </w:rPr>
+        <w:tab/>
+      </w:r>
+      <w:r>
+        <w:rPr>
+          <w:rFonts w:ascii="Times New Roman" w:hAnsi="Times New Roman"/>
+          <w:b w:val="0"/>
+          <w:color w:val="1E1E1E"/>
+          <w:sz w:val="23"/>
+        </w:rPr>
+        <w:t>5</w:t>
+      </w:r>
+    </w:p>
+    <w:p>
+      <w:pPr>
+        <w:spacing w:before="40" w:after="40" w:line="276" w:lineRule="auto"/>
+        <w:tabs>
+          <w:tab w:val="right" w:leader="dot" w:pos="9070"/>
+        </w:tabs>
+      </w:pPr>
+      <w:r>
+        <w:rPr>
+          <w:rFonts w:ascii="Times New Roman" w:hAnsi="Times New Roman"/>
+          <w:b/>
+          <w:color w:val="1E1E1E"/>
+          <w:sz w:val="23"/>
+        </w:rPr>
+        <w:t>CHƯƠNG 2: CƠ SỞ LÝ THUYẾT VÀ CÁC CÔNG TRÌNH LIÊN QUAN</w:t>
+      </w:r>
+      <w:r>
+        <w:rPr>
+          <w:rFonts w:ascii="Times New Roman" w:hAnsi="Times New Roman"/>
+        </w:rPr>
+        <w:tab/>
+      </w:r>
+      <w:r>
+        <w:rPr>
+          <w:rFonts w:ascii="Times New Roman" w:hAnsi="Times New Roman"/>
+          <w:b/>
+          <w:color w:val="1E1E1E"/>
+          <w:sz w:val="23"/>
+        </w:rPr>
+        <w:t>6</w:t>
+      </w:r>
+    </w:p>
+    <w:p>
+      <w:pPr>
+        <w:spacing w:before="40" w:after="40" w:line="276" w:lineRule="auto"/>
+        <w:tabs>
+          <w:tab w:val="right" w:leader="dot" w:pos="9070"/>
+        </w:tabs>
+        <w:ind w:left="360"/>
+      </w:pPr>
+      <w:r>
+        <w:rPr>
+          <w:rFonts w:ascii="Times New Roman" w:hAnsi="Times New Roman"/>
+          <w:b w:val="0"/>
+          <w:color w:val="1E1E1E"/>
+          <w:sz w:val="23"/>
+        </w:rPr>
+        <w:t>2.1. Hệ thống kiểm chứng thông tin (Fact Verification) và Bài toán FEVER</w:t>
+      </w:r>
+      <w:r>
+        <w:rPr>
+          <w:rFonts w:ascii="Times New Roman" w:hAnsi="Times New Roman"/>
+        </w:rPr>
+        <w:tab/>
+      </w:r>
+      <w:r>
+        <w:rPr>
+          <w:rFonts w:ascii="Times New Roman" w:hAnsi="Times New Roman"/>
+          <w:b w:val="0"/>
+          <w:color w:val="1E1E1E"/>
+          <w:sz w:val="23"/>
+        </w:rPr>
+        <w:t>6</w:t>
+      </w:r>
+    </w:p>
+    <w:p>
+      <w:pPr>
+        <w:spacing w:before="40" w:after="40" w:line="276" w:lineRule="auto"/>
+        <w:tabs>
+          <w:tab w:val="right" w:leader="dot" w:pos="9070"/>
+        </w:tabs>
+        <w:ind w:left="360"/>
+      </w:pPr>
+      <w:r>
+        <w:rPr>
+          <w:rFonts w:ascii="Times New Roman" w:hAnsi="Times New Roman"/>
+          <w:b w:val="0"/>
+          <w:color w:val="1E1E1E"/>
+          <w:sz w:val="23"/>
+        </w:rPr>
+        <w:t>2.2. Kiến trúc Retrieval-Augmented Generation (RAG)</w:t>
+      </w:r>
+      <w:r>
+        <w:rPr>
+          <w:rFonts w:ascii="Times New Roman" w:hAnsi="Times New Roman"/>
+        </w:rPr>
+        <w:tab/>
+      </w:r>
+      <w:r>
+        <w:rPr>
+          <w:rFonts w:ascii="Times New Roman" w:hAnsi="Times New Roman"/>
+          <w:b w:val="0"/>
+          <w:color w:val="1E1E1E"/>
+          <w:sz w:val="23"/>
+        </w:rPr>
+        <w:t>7</w:t>
+      </w:r>
+    </w:p>
+    <w:p>
+      <w:pPr>
+        <w:spacing w:before="40" w:after="40" w:line="276" w:lineRule="auto"/>
+        <w:tabs>
+          <w:tab w:val="right" w:leader="dot" w:pos="9070"/>
+        </w:tabs>
+        <w:ind w:left="360"/>
+      </w:pPr>
+      <w:r>
+        <w:rPr>
+          <w:rFonts w:ascii="Times New Roman" w:hAnsi="Times New Roman"/>
+          <w:b w:val="0"/>
+          <w:color w:val="1E1E1E"/>
+          <w:sz w:val="23"/>
+        </w:rPr>
+        <w:t>2.3. Thuật toán truy xuất từ vựng BM25 (Best Matching 25)</w:t>
+      </w:r>
+      <w:r>
+        <w:rPr>
+          <w:rFonts w:ascii="Times New Roman" w:hAnsi="Times New Roman"/>
+        </w:rPr>
+        <w:tab/>
+      </w:r>
+      <w:r>
+        <w:rPr>
+          <w:rFonts w:ascii="Times New Roman" w:hAnsi="Times New Roman"/>
+          <w:b w:val="0"/>
+          <w:color w:val="1E1E1E"/>
+          <w:sz w:val="23"/>
+        </w:rPr>
+        <w:t>8</w:t>
+      </w:r>
+    </w:p>
+    <w:p>
+      <w:pPr>
+        <w:spacing w:before="40" w:after="40" w:line="276" w:lineRule="auto"/>
+        <w:tabs>
+          <w:tab w:val="right" w:leader="dot" w:pos="9070"/>
+        </w:tabs>
+        <w:ind w:left="360"/>
+      </w:pPr>
+      <w:r>
+        <w:rPr>
+          <w:rFonts w:ascii="Times New Roman" w:hAnsi="Times New Roman"/>
+          <w:b w:val="0"/>
+          <w:color w:val="1E1E1E"/>
+          <w:sz w:val="23"/>
+        </w:rPr>
+        <w:t>2.4. Mô hình biểu diễn ngữ nghĩa đa ngôn ngữ BGE-M3</w:t>
+      </w:r>
+      <w:r>
+        <w:rPr>
+          <w:rFonts w:ascii="Times New Roman" w:hAnsi="Times New Roman"/>
+        </w:rPr>
+        <w:tab/>
+      </w:r>
+      <w:r>
+        <w:rPr>
+          <w:rFonts w:ascii="Times New Roman" w:hAnsi="Times New Roman"/>
+          <w:b w:val="0"/>
+          <w:color w:val="1E1E1E"/>
+          <w:sz w:val="23"/>
+        </w:rPr>
+        <w:t>9</w:t>
+      </w:r>
+    </w:p>
+    <w:p>
+      <w:pPr>
+        <w:spacing w:before="40" w:after="40" w:line="276" w:lineRule="auto"/>
+        <w:tabs>
+          <w:tab w:val="right" w:leader="dot" w:pos="9070"/>
+        </w:tabs>
+        <w:ind w:left="360"/>
+      </w:pPr>
+      <w:r>
+        <w:rPr>
+          <w:rFonts w:ascii="Times New Roman" w:hAnsi="Times New Roman"/>
+          <w:b w:val="0"/>
+          <w:color w:val="1E1E1E"/>
+          <w:sz w:val="23"/>
+        </w:rPr>
+        <w:t>2.5. Dung hợp thứ hạng nghịch đảo (Reciprocal Rank Fusion - RRF)</w:t>
+      </w:r>
+      <w:r>
+        <w:rPr>
+          <w:rFonts w:ascii="Times New Roman" w:hAnsi="Times New Roman"/>
+        </w:rPr>
+        <w:tab/>
+      </w:r>
+      <w:r>
+        <w:rPr>
+          <w:rFonts w:ascii="Times New Roman" w:hAnsi="Times New Roman"/>
+          <w:b w:val="0"/>
+          <w:color w:val="1E1E1E"/>
+          <w:sz w:val="23"/>
+        </w:rPr>
+        <w:t>10</w:t>
+      </w:r>
+    </w:p>
+    <w:p>
+      <w:pPr>
+        <w:spacing w:before="40" w:after="40" w:line="276" w:lineRule="auto"/>
+        <w:tabs>
+          <w:tab w:val="right" w:leader="dot" w:pos="9070"/>
+        </w:tabs>
+        <w:ind w:left="360"/>
+      </w:pPr>
+      <w:r>
+        <w:rPr>
+          <w:rFonts w:ascii="Times New Roman" w:hAnsi="Times New Roman"/>
+          <w:b w:val="0"/>
+          <w:color w:val="1E1E1E"/>
+          <w:sz w:val="23"/>
+        </w:rPr>
+        <w:t>2.6. Tái xếp hạng bằng Cross-Encoder Reranker</w:t>
+      </w:r>
+      <w:r>
+        <w:rPr>
+          <w:rFonts w:ascii="Times New Roman" w:hAnsi="Times New Roman"/>
+        </w:rPr>
+        <w:tab/>
+      </w:r>
+      <w:r>
+        <w:rPr>
+          <w:rFonts w:ascii="Times New Roman" w:hAnsi="Times New Roman"/>
+          <w:b w:val="0"/>
+          <w:color w:val="1E1E1E"/>
+          <w:sz w:val="23"/>
+        </w:rPr>
+        <w:t>11</w:t>
+      </w:r>
+    </w:p>
+    <w:p>
+      <w:pPr>
+        <w:spacing w:before="40" w:after="40" w:line="276" w:lineRule="auto"/>
+        <w:tabs>
+          <w:tab w:val="right" w:leader="dot" w:pos="9070"/>
+        </w:tabs>
+        <w:ind w:left="360"/>
+      </w:pPr>
+      <w:r>
+        <w:rPr>
+          <w:rFonts w:ascii="Times New Roman" w:hAnsi="Times New Roman"/>
+          <w:b w:val="0"/>
+          <w:color w:val="1E1E1E"/>
+          <w:sz w:val="23"/>
+        </w:rPr>
+        <w:t>2.7. Mô hình Qwen2.5-7B-Instruct và Kỹ thuật lượng tử hóa 4-bit NF4</w:t>
+      </w:r>
+      <w:r>
+        <w:rPr>
+          <w:rFonts w:ascii="Times New Roman" w:hAnsi="Times New Roman"/>
+        </w:rPr>
+        <w:tab/>
+      </w:r>
+      <w:r>
+        <w:rPr>
+          <w:rFonts w:ascii="Times New Roman" w:hAnsi="Times New Roman"/>
+          <w:b w:val="0"/>
+          <w:color w:val="1E1E1E"/>
+          <w:sz w:val="23"/>
+        </w:rPr>
+        <w:t>12</w:t>
+      </w:r>
+    </w:p>
+    <w:p>
+      <w:pPr>
+        <w:spacing w:before="40" w:after="40" w:line="276" w:lineRule="auto"/>
+        <w:tabs>
+          <w:tab w:val="right" w:leader="dot" w:pos="9070"/>
+        </w:tabs>
+        <w:ind w:left="360"/>
+      </w:pPr>
+      <w:r>
+        <w:rPr>
+          <w:rFonts w:ascii="Times New Roman" w:hAnsi="Times New Roman"/>
+          <w:b w:val="0"/>
+          <w:color w:val="1E1E1E"/>
+          <w:sz w:val="23"/>
+        </w:rPr>
+        <w:t>2.8. Thách thức đặc thù trong Xử lý ngôn ngữ tự nhiên tiếng Việt</w:t>
+      </w:r>
+      <w:r>
+        <w:rPr>
+          <w:rFonts w:ascii="Times New Roman" w:hAnsi="Times New Roman"/>
+        </w:rPr>
+        <w:tab/>
+      </w:r>
+      <w:r>
+        <w:rPr>
+          <w:rFonts w:ascii="Times New Roman" w:hAnsi="Times New Roman"/>
+          <w:b w:val="0"/>
+          <w:color w:val="1E1E1E"/>
+          <w:sz w:val="23"/>
+        </w:rPr>
+        <w:t>13</w:t>
+      </w:r>
+    </w:p>
+    <w:p>
+      <w:pPr>
+        <w:spacing w:before="40" w:after="40" w:line="276" w:lineRule="auto"/>
+        <w:tabs>
+          <w:tab w:val="right" w:leader="dot" w:pos="9070"/>
+        </w:tabs>
+        <w:ind w:left="720"/>
+      </w:pPr>
+      <w:r>
+        <w:rPr>
+          <w:rFonts w:ascii="Times New Roman" w:hAnsi="Times New Roman"/>
+          <w:b w:val="0"/>
+          <w:color w:val="1E1E1E"/>
+          <w:sz w:val="23"/>
+        </w:rPr>
+        <w:t>2.8.1. Phân định ranh giới từ (Word Segmentation)</w:t>
+      </w:r>
+      <w:r>
+        <w:rPr>
+          <w:rFonts w:ascii="Times New Roman" w:hAnsi="Times New Roman"/>
+        </w:rPr>
+        <w:tab/>
+      </w:r>
+      <w:r>
+        <w:rPr>
+          <w:rFonts w:ascii="Times New Roman" w:hAnsi="Times New Roman"/>
+          <w:b w:val="0"/>
+          <w:color w:val="1E1E1E"/>
+          <w:sz w:val="23"/>
+        </w:rPr>
+        <w:t>13</w:t>
+      </w:r>
+    </w:p>
+    <w:p>
+      <w:pPr>
+        <w:spacing w:before="40" w:after="40" w:line="276" w:lineRule="auto"/>
+        <w:tabs>
+          <w:tab w:val="right" w:leader="dot" w:pos="9070"/>
+        </w:tabs>
+        <w:ind w:left="720"/>
+      </w:pPr>
+      <w:r>
+        <w:rPr>
+          <w:rFonts w:ascii="Times New Roman" w:hAnsi="Times New Roman"/>
+          <w:b w:val="0"/>
+          <w:color w:val="1E1E1E"/>
+          <w:sz w:val="23"/>
+        </w:rPr>
+        <w:t>2.8.2. Dấu thanh điệu và Chuẩn hóa Unicode</w:t>
+      </w:r>
+      <w:r>
+        <w:rPr>
+          <w:rFonts w:ascii="Times New Roman" w:hAnsi="Times New Roman"/>
+        </w:rPr>
+        <w:tab/>
+      </w:r>
+      <w:r>
+        <w:rPr>
+          <w:rFonts w:ascii="Times New Roman" w:hAnsi="Times New Roman"/>
+          <w:b w:val="0"/>
+          <w:color w:val="1E1E1E"/>
+          <w:sz w:val="23"/>
+        </w:rPr>
+        <w:t>13</w:t>
+      </w:r>
+    </w:p>
+    <w:p>
+      <w:pPr>
+        <w:spacing w:before="40" w:after="40" w:line="276" w:lineRule="auto"/>
+        <w:tabs>
+          <w:tab w:val="right" w:leader="dot" w:pos="9070"/>
+        </w:tabs>
+        <w:ind w:left="720"/>
+      </w:pPr>
+      <w:r>
+        <w:rPr>
+          <w:rFonts w:ascii="Times New Roman" w:hAnsi="Times New Roman"/>
+          <w:b w:val="0"/>
+          <w:color w:val="1E1E1E"/>
+          <w:sz w:val="23"/>
+        </w:rPr>
+        <w:t>2.8.3. Khan hiếm tài nguyên ngữ liệu kiểm chứng</w:t>
+      </w:r>
+      <w:r>
+        <w:rPr>
+          <w:rFonts w:ascii="Times New Roman" w:hAnsi="Times New Roman"/>
+        </w:rPr>
+        <w:tab/>
+      </w:r>
+      <w:r>
+        <w:rPr>
+          <w:rFonts w:ascii="Times New Roman" w:hAnsi="Times New Roman"/>
+          <w:b w:val="0"/>
+          <w:color w:val="1E1E1E"/>
+          <w:sz w:val="23"/>
+        </w:rPr>
+        <w:t>14</w:t>
+      </w:r>
+    </w:p>
+    <w:p>
+      <w:pPr>
+        <w:spacing w:before="40" w:after="40" w:line="276" w:lineRule="auto"/>
+        <w:tabs>
+          <w:tab w:val="right" w:leader="dot" w:pos="9070"/>
+        </w:tabs>
+        <w:ind w:left="360"/>
+      </w:pPr>
+      <w:r>
+        <w:rPr>
+          <w:rFonts w:ascii="Times New Roman" w:hAnsi="Times New Roman"/>
+          <w:b w:val="0"/>
+          <w:color w:val="1E1E1E"/>
+          <w:sz w:val="23"/>
+        </w:rPr>
+        <w:t>2.9. Khảo sát toàn diện các Baseline và Công trình liên quan</w:t>
+      </w:r>
+      <w:r>
+        <w:rPr>
+          <w:rFonts w:ascii="Times New Roman" w:hAnsi="Times New Roman"/>
+        </w:rPr>
+        <w:tab/>
+      </w:r>
+      <w:r>
+        <w:rPr>
+          <w:rFonts w:ascii="Times New Roman" w:hAnsi="Times New Roman"/>
+          <w:b w:val="0"/>
+          <w:color w:val="1E1E1E"/>
+          <w:sz w:val="23"/>
+        </w:rPr>
+        <w:t>14</w:t>
+      </w:r>
+    </w:p>
+    <w:p>
+      <w:pPr>
+        <w:spacing w:before="40" w:after="40" w:line="276" w:lineRule="auto"/>
+        <w:tabs>
+          <w:tab w:val="right" w:leader="dot" w:pos="9070"/>
+        </w:tabs>
+        <w:ind w:left="720"/>
+      </w:pPr>
+      <w:r>
+        <w:rPr>
+          <w:rFonts w:ascii="Times New Roman" w:hAnsi="Times New Roman"/>
+          <w:b w:val="0"/>
+          <w:color w:val="1E1E1E"/>
+          <w:sz w:val="23"/>
+        </w:rPr>
+        <w:t>2.9.1. Baseline 1: BM25 + InfoXLM-Large (ViWikiFC gốc)</w:t>
+      </w:r>
+      <w:r>
+        <w:rPr>
+          <w:rFonts w:ascii="Times New Roman" w:hAnsi="Times New Roman"/>
+        </w:rPr>
+        <w:tab/>
+      </w:r>
+      <w:r>
+        <w:rPr>
+          <w:rFonts w:ascii="Times New Roman" w:hAnsi="Times New Roman"/>
+          <w:b w:val="0"/>
+          <w:color w:val="1E1E1E"/>
+          <w:sz w:val="23"/>
+        </w:rPr>
+        <w:t>14</w:t>
+      </w:r>
+    </w:p>
+    <w:p>
+      <w:pPr>
+        <w:spacing w:before="40" w:after="40" w:line="276" w:lineRule="auto"/>
+        <w:tabs>
+          <w:tab w:val="right" w:leader="dot" w:pos="9070"/>
+        </w:tabs>
+        <w:ind w:left="720"/>
+      </w:pPr>
+      <w:r>
+        <w:rPr>
+          <w:rFonts w:ascii="Times New Roman" w:hAnsi="Times New Roman"/>
+          <w:b w:val="0"/>
+          <w:color w:val="1E1E1E"/>
+          <w:sz w:val="23"/>
+        </w:rPr>
+        <w:t>2.9.2. Baseline 2: SemViQA / SemViQA Faster (SOTA ViWikiFC)</w:t>
+      </w:r>
+      <w:r>
+        <w:rPr>
+          <w:rFonts w:ascii="Times New Roman" w:hAnsi="Times New Roman"/>
+        </w:rPr>
+        <w:tab/>
+      </w:r>
+      <w:r>
+        <w:rPr>
+          <w:rFonts w:ascii="Times New Roman" w:hAnsi="Times New Roman"/>
+          <w:b w:val="0"/>
+          <w:color w:val="1E1E1E"/>
+          <w:sz w:val="23"/>
+        </w:rPr>
+        <w:t>15</w:t>
+      </w:r>
+    </w:p>
+    <w:p>
+      <w:pPr>
+        <w:spacing w:before="40" w:after="40" w:line="276" w:lineRule="auto"/>
+        <w:tabs>
+          <w:tab w:val="right" w:leader="dot" w:pos="9070"/>
+        </w:tabs>
+        <w:ind w:left="720"/>
+      </w:pPr>
+      <w:r>
+        <w:rPr>
+          <w:rFonts w:ascii="Times New Roman" w:hAnsi="Times New Roman"/>
+          <w:b w:val="0"/>
+          <w:color w:val="1E1E1E"/>
+          <w:sz w:val="23"/>
+        </w:rPr>
+        <w:t>2.9.3. Baseline 3: ViFactCheck Baseline (AAAI 2025)</w:t>
+      </w:r>
+      <w:r>
+        <w:rPr>
+          <w:rFonts w:ascii="Times New Roman" w:hAnsi="Times New Roman"/>
+        </w:rPr>
+        <w:tab/>
+      </w:r>
+      <w:r>
+        <w:rPr>
+          <w:rFonts w:ascii="Times New Roman" w:hAnsi="Times New Roman"/>
+          <w:b w:val="0"/>
+          <w:color w:val="1E1E1E"/>
+          <w:sz w:val="23"/>
+        </w:rPr>
+        <w:t>15</w:t>
+      </w:r>
+    </w:p>
+    <w:p>
+      <w:pPr>
+        <w:spacing w:before="40" w:after="40" w:line="276" w:lineRule="auto"/>
+        <w:tabs>
+          <w:tab w:val="right" w:leader="dot" w:pos="9070"/>
+        </w:tabs>
+        <w:ind w:left="720"/>
+      </w:pPr>
+      <w:r>
+        <w:rPr>
+          <w:rFonts w:ascii="Times New Roman" w:hAnsi="Times New Roman"/>
+          <w:b w:val="0"/>
+          <w:color w:val="1E1E1E"/>
+          <w:sz w:val="23"/>
+        </w:rPr>
+        <w:t>2.9.4. Baseline 4: ReINTEL SOTA Baseline (VLSP 2020)</w:t>
+      </w:r>
+      <w:r>
+        <w:rPr>
+          <w:rFonts w:ascii="Times New Roman" w:hAnsi="Times New Roman"/>
+        </w:rPr>
+        <w:tab/>
+      </w:r>
+      <w:r>
+        <w:rPr>
+          <w:rFonts w:ascii="Times New Roman" w:hAnsi="Times New Roman"/>
+          <w:b w:val="0"/>
+          <w:color w:val="1E1E1E"/>
+          <w:sz w:val="23"/>
+        </w:rPr>
+        <w:t>16</w:t>
+      </w:r>
+    </w:p>
+    <w:p>
+      <w:pPr>
+        <w:spacing w:before="40" w:after="40" w:line="276" w:lineRule="auto"/>
+        <w:tabs>
+          <w:tab w:val="right" w:leader="dot" w:pos="9070"/>
+        </w:tabs>
+        <w:ind w:left="720"/>
+      </w:pPr>
+      <w:r>
+        <w:rPr>
+          <w:rFonts w:ascii="Times New Roman" w:hAnsi="Times New Roman"/>
+          <w:b w:val="0"/>
+          <w:color w:val="1E1E1E"/>
+          <w:sz w:val="23"/>
+        </w:rPr>
+        <w:t>2.9.5. Baseline 5: Program-FC (ACL 2023)</w:t>
+      </w:r>
+      <w:r>
+        <w:rPr>
+          <w:rFonts w:ascii="Times New Roman" w:hAnsi="Times New Roman"/>
+        </w:rPr>
+        <w:tab/>
+      </w:r>
+      <w:r>
+        <w:rPr>
+          <w:rFonts w:ascii="Times New Roman" w:hAnsi="Times New Roman"/>
+          <w:b w:val="0"/>
+          <w:color w:val="1E1E1E"/>
+          <w:sz w:val="23"/>
+        </w:rPr>
+        <w:t>16</w:t>
+      </w:r>
+    </w:p>
+    <w:p>
+      <w:pPr>
+        <w:spacing w:before="40" w:after="40" w:line="276" w:lineRule="auto"/>
+        <w:tabs>
+          <w:tab w:val="right" w:leader="dot" w:pos="9070"/>
+        </w:tabs>
+        <w:ind w:left="720"/>
+      </w:pPr>
+      <w:r>
+        <w:rPr>
+          <w:rFonts w:ascii="Times New Roman" w:hAnsi="Times New Roman"/>
+          <w:b w:val="0"/>
+          <w:color w:val="1E1E1E"/>
+          <w:sz w:val="23"/>
+        </w:rPr>
+        <w:t>2.9.6. Baseline 6: Self-Checker / RAG-FactLLM (2024)</w:t>
+      </w:r>
+      <w:r>
+        <w:rPr>
+          <w:rFonts w:ascii="Times New Roman" w:hAnsi="Times New Roman"/>
+        </w:rPr>
+        <w:tab/>
+      </w:r>
+      <w:r>
+        <w:rPr>
+          <w:rFonts w:ascii="Times New Roman" w:hAnsi="Times New Roman"/>
+          <w:b w:val="0"/>
+          <w:color w:val="1E1E1E"/>
+          <w:sz w:val="23"/>
+        </w:rPr>
+        <w:t>17</w:t>
+      </w:r>
+    </w:p>
+    <w:p>
+      <w:pPr>
+        <w:spacing w:before="40" w:after="40" w:line="276" w:lineRule="auto"/>
+        <w:tabs>
+          <w:tab w:val="right" w:leader="dot" w:pos="9070"/>
+        </w:tabs>
+        <w:ind w:left="720"/>
+      </w:pPr>
+      <w:r>
+        <w:rPr>
+          <w:rFonts w:ascii="Times New Roman" w:hAnsi="Times New Roman"/>
+          <w:b w:val="0"/>
+          <w:color w:val="1E1E1E"/>
+          <w:sz w:val="23"/>
+        </w:rPr>
+        <w:t>2.9.7. Baseline 7: LLM Direct Prompting (Ablation)</w:t>
+      </w:r>
+      <w:r>
+        <w:rPr>
+          <w:rFonts w:ascii="Times New Roman" w:hAnsi="Times New Roman"/>
+        </w:rPr>
+        <w:tab/>
+      </w:r>
+      <w:r>
+        <w:rPr>
+          <w:rFonts w:ascii="Times New Roman" w:hAnsi="Times New Roman"/>
+          <w:b w:val="0"/>
+          <w:color w:val="1E1E1E"/>
+          <w:sz w:val="23"/>
+        </w:rPr>
+        <w:t>17</w:t>
+      </w:r>
+    </w:p>
+    <w:p>
+      <w:pPr>
+        <w:spacing w:before="40" w:after="40" w:line="276" w:lineRule="auto"/>
+        <w:tabs>
+          <w:tab w:val="right" w:leader="dot" w:pos="9070"/>
+        </w:tabs>
+      </w:pPr>
+      <w:r>
+        <w:rPr>
+          <w:rFonts w:ascii="Times New Roman" w:hAnsi="Times New Roman"/>
+          <w:b/>
+          <w:color w:val="1E1E1E"/>
+          <w:sz w:val="23"/>
+        </w:rPr>
+        <w:t>CHƯƠNG 3: DỮ LIỆU THỰC NGHIỆM VÀ QUY TRÌNH TIỀN XỬ LÝ</w:t>
+      </w:r>
+      <w:r>
+        <w:rPr>
+          <w:rFonts w:ascii="Times New Roman" w:hAnsi="Times New Roman"/>
+        </w:rPr>
+        <w:tab/>
+      </w:r>
+      <w:r>
+        <w:rPr>
+          <w:rFonts w:ascii="Times New Roman" w:hAnsi="Times New Roman"/>
+          <w:b/>
+          <w:color w:val="1E1E1E"/>
+          <w:sz w:val="23"/>
+        </w:rPr>
+        <w:t>18</w:t>
+      </w:r>
+    </w:p>
+    <w:p>
+      <w:pPr>
+        <w:spacing w:before="40" w:after="40" w:line="276" w:lineRule="auto"/>
+        <w:tabs>
+          <w:tab w:val="right" w:leader="dot" w:pos="9070"/>
+        </w:tabs>
+        <w:ind w:left="360"/>
+      </w:pPr>
+      <w:r>
+        <w:rPr>
+          <w:rFonts w:ascii="Times New Roman" w:hAnsi="Times New Roman"/>
+          <w:b w:val="0"/>
+          <w:color w:val="1E1E1E"/>
+          <w:sz w:val="23"/>
+        </w:rPr>
+        <w:t>3.1. Khảo sát các bộ dữ liệu Fact-Checking và Fake News đã công bố</w:t>
+      </w:r>
+      <w:r>
+        <w:rPr>
+          <w:rFonts w:ascii="Times New Roman" w:hAnsi="Times New Roman"/>
+        </w:rPr>
+        <w:tab/>
+      </w:r>
+      <w:r>
+        <w:rPr>
+          <w:rFonts w:ascii="Times New Roman" w:hAnsi="Times New Roman"/>
+          <w:b w:val="0"/>
+          <w:color w:val="1E1E1E"/>
+          <w:sz w:val="23"/>
+        </w:rPr>
+        <w:t>18</w:t>
+      </w:r>
+    </w:p>
+    <w:p>
+      <w:pPr>
+        <w:spacing w:before="40" w:after="40" w:line="276" w:lineRule="auto"/>
+        <w:tabs>
+          <w:tab w:val="right" w:leader="dot" w:pos="9070"/>
+        </w:tabs>
+        <w:ind w:left="360"/>
+      </w:pPr>
+      <w:r>
+        <w:rPr>
+          <w:rFonts w:ascii="Times New Roman" w:hAnsi="Times New Roman"/>
+          <w:b w:val="0"/>
+          <w:color w:val="1E1E1E"/>
+          <w:sz w:val="23"/>
+        </w:rPr>
+        <w:t>3.2. Tập dữ liệu ViWikiFC (Bách khoa toàn thư Wikipedia)</w:t>
+      </w:r>
+      <w:r>
+        <w:rPr>
+          <w:rFonts w:ascii="Times New Roman" w:hAnsi="Times New Roman"/>
+        </w:rPr>
+        <w:tab/>
+      </w:r>
+      <w:r>
+        <w:rPr>
+          <w:rFonts w:ascii="Times New Roman" w:hAnsi="Times New Roman"/>
+          <w:b w:val="0"/>
+          <w:color w:val="1E1E1E"/>
+          <w:sz w:val="23"/>
+        </w:rPr>
+        <w:t>19</w:t>
+      </w:r>
+    </w:p>
+    <w:p>
+      <w:pPr>
+        <w:spacing w:before="40" w:after="40" w:line="276" w:lineRule="auto"/>
+        <w:tabs>
+          <w:tab w:val="right" w:leader="dot" w:pos="9070"/>
+        </w:tabs>
+        <w:ind w:left="360"/>
+      </w:pPr>
+      <w:r>
+        <w:rPr>
+          <w:rFonts w:ascii="Times New Roman" w:hAnsi="Times New Roman"/>
+          <w:b w:val="0"/>
+          <w:color w:val="1E1E1E"/>
+          <w:sz w:val="23"/>
+        </w:rPr>
+        <w:t>3.3. Tập dữ liệu ViFactCheck (Báo chí chính thống đa lĩnh vực - AAAI 2025)</w:t>
+      </w:r>
+      <w:r>
+        <w:rPr>
+          <w:rFonts w:ascii="Times New Roman" w:hAnsi="Times New Roman"/>
+        </w:rPr>
+        <w:tab/>
+      </w:r>
+      <w:r>
+        <w:rPr>
+          <w:rFonts w:ascii="Times New Roman" w:hAnsi="Times New Roman"/>
+          <w:b w:val="0"/>
+          <w:color w:val="1E1E1E"/>
+          <w:sz w:val="23"/>
+        </w:rPr>
+        <w:t>20</w:t>
+      </w:r>
+    </w:p>
+    <w:p>
+      <w:pPr>
+        <w:spacing w:before="40" w:after="40" w:line="276" w:lineRule="auto"/>
+        <w:tabs>
+          <w:tab w:val="right" w:leader="dot" w:pos="9070"/>
+        </w:tabs>
+        <w:ind w:left="360"/>
+      </w:pPr>
+      <w:r>
+        <w:rPr>
+          <w:rFonts w:ascii="Times New Roman" w:hAnsi="Times New Roman"/>
+          <w:b w:val="0"/>
+          <w:color w:val="1E1E1E"/>
+          <w:sz w:val="23"/>
+        </w:rPr>
+        <w:t>3.4. Quy trình Chuẩn hóa và Hợp nhất dữ liệu (Data Harmonization)</w:t>
+      </w:r>
+      <w:r>
+        <w:rPr>
+          <w:rFonts w:ascii="Times New Roman" w:hAnsi="Times New Roman"/>
+        </w:rPr>
+        <w:tab/>
+      </w:r>
+      <w:r>
+        <w:rPr>
+          <w:rFonts w:ascii="Times New Roman" w:hAnsi="Times New Roman"/>
+          <w:b w:val="0"/>
+          <w:color w:val="1E1E1E"/>
+          <w:sz w:val="23"/>
+        </w:rPr>
+        <w:t>21</w:t>
+      </w:r>
+    </w:p>
+    <w:p>
+      <w:pPr>
+        <w:spacing w:before="40" w:after="40" w:line="276" w:lineRule="auto"/>
+        <w:tabs>
+          <w:tab w:val="right" w:leader="dot" w:pos="9070"/>
+        </w:tabs>
+        <w:ind w:left="360"/>
+      </w:pPr>
+      <w:r>
+        <w:rPr>
+          <w:rFonts w:ascii="Times New Roman" w:hAnsi="Times New Roman"/>
+          <w:b w:val="0"/>
+          <w:color w:val="1E1E1E"/>
+          <w:sz w:val="23"/>
+        </w:rPr>
+        <w:t>3.5. Xây dựng Kho ngữ liệu tri thức thống nhất (Unified Evidence Corpus)</w:t>
+      </w:r>
+      <w:r>
+        <w:rPr>
+          <w:rFonts w:ascii="Times New Roman" w:hAnsi="Times New Roman"/>
+        </w:rPr>
+        <w:tab/>
+      </w:r>
+      <w:r>
+        <w:rPr>
+          <w:rFonts w:ascii="Times New Roman" w:hAnsi="Times New Roman"/>
+          <w:b w:val="0"/>
+          <w:color w:val="1E1E1E"/>
+          <w:sz w:val="23"/>
+        </w:rPr>
+        <w:t>22</w:t>
+      </w:r>
+    </w:p>
+    <w:p>
+      <w:pPr>
+        <w:spacing w:before="40" w:after="40" w:line="276" w:lineRule="auto"/>
+        <w:tabs>
+          <w:tab w:val="right" w:leader="dot" w:pos="9070"/>
+        </w:tabs>
+      </w:pPr>
+      <w:r>
+        <w:rPr>
+          <w:rFonts w:ascii="Times New Roman" w:hAnsi="Times New Roman"/>
+          <w:b/>
+          <w:color w:val="1E1E1E"/>
+          <w:sz w:val="23"/>
+        </w:rPr>
+        <w:t>CHƯƠNG 4: PHƯƠNG PHÁP ĐỀ XUẤT: HỆ THỐNG SER + TVC + RAG</w:t>
+      </w:r>
+      <w:r>
+        <w:rPr>
+          <w:rFonts w:ascii="Times New Roman" w:hAnsi="Times New Roman"/>
+        </w:rPr>
+        <w:tab/>
+      </w:r>
+      <w:r>
+        <w:rPr>
+          <w:rFonts w:ascii="Times New Roman" w:hAnsi="Times New Roman"/>
+          <w:b/>
+          <w:color w:val="1E1E1E"/>
+          <w:sz w:val="23"/>
+        </w:rPr>
+        <w:t>23</w:t>
+      </w:r>
+    </w:p>
+    <w:p>
+      <w:pPr>
+        <w:spacing w:before="40" w:after="40" w:line="276" w:lineRule="auto"/>
+        <w:tabs>
+          <w:tab w:val="right" w:leader="dot" w:pos="9070"/>
+        </w:tabs>
+        <w:ind w:left="360"/>
+      </w:pPr>
+      <w:r>
+        <w:rPr>
+          <w:rFonts w:ascii="Times New Roman" w:hAnsi="Times New Roman"/>
+          <w:b w:val="0"/>
+          <w:color w:val="1E1E1E"/>
+          <w:sz w:val="23"/>
+        </w:rPr>
+        <w:t>4.1. Kiến trúc tổng thể hệ thống</w:t>
+      </w:r>
+      <w:r>
+        <w:rPr>
+          <w:rFonts w:ascii="Times New Roman" w:hAnsi="Times New Roman"/>
+        </w:rPr>
+        <w:tab/>
+      </w:r>
+      <w:r>
+        <w:rPr>
+          <w:rFonts w:ascii="Times New Roman" w:hAnsi="Times New Roman"/>
+          <w:b w:val="0"/>
+          <w:color w:val="1E1E1E"/>
+          <w:sz w:val="23"/>
+        </w:rPr>
+        <w:t>23</w:t>
+      </w:r>
+    </w:p>
+    <w:p>
+      <w:pPr>
+        <w:spacing w:before="40" w:after="40" w:line="276" w:lineRule="auto"/>
+        <w:tabs>
+          <w:tab w:val="right" w:leader="dot" w:pos="9070"/>
+        </w:tabs>
+        <w:ind w:left="360"/>
+      </w:pPr>
+      <w:r>
+        <w:rPr>
+          <w:rFonts w:ascii="Times New Roman" w:hAnsi="Times New Roman"/>
+          <w:b w:val="0"/>
+          <w:color w:val="1E1E1E"/>
+          <w:sz w:val="23"/>
+        </w:rPr>
+        <w:t>4.2. Mô-đun Truy xuất bằng chứng ngữ nghĩa (Semantic Evidence Retrieval - SER)</w:t>
+      </w:r>
+      <w:r>
+        <w:rPr>
+          <w:rFonts w:ascii="Times New Roman" w:hAnsi="Times New Roman"/>
+        </w:rPr>
+        <w:tab/>
+      </w:r>
+      <w:r>
+        <w:rPr>
+          <w:rFonts w:ascii="Times New Roman" w:hAnsi="Times New Roman"/>
+          <w:b w:val="0"/>
+          <w:color w:val="1E1E1E"/>
+          <w:sz w:val="23"/>
+        </w:rPr>
+        <w:t>24</w:t>
+      </w:r>
+    </w:p>
+    <w:p>
+      <w:pPr>
+        <w:spacing w:before="40" w:after="40" w:line="276" w:lineRule="auto"/>
+        <w:tabs>
+          <w:tab w:val="right" w:leader="dot" w:pos="9070"/>
+        </w:tabs>
+        <w:ind w:left="720"/>
+      </w:pPr>
+      <w:r>
+        <w:rPr>
+          <w:rFonts w:ascii="Times New Roman" w:hAnsi="Times New Roman"/>
+          <w:b w:val="0"/>
+          <w:color w:val="1E1E1E"/>
+          <w:sz w:val="23"/>
+        </w:rPr>
+        <w:t>4.2.1. Sparse Retrieval với BM25Okapi</w:t>
+      </w:r>
+      <w:r>
+        <w:rPr>
+          <w:rFonts w:ascii="Times New Roman" w:hAnsi="Times New Roman"/>
+        </w:rPr>
+        <w:tab/>
+      </w:r>
+      <w:r>
+        <w:rPr>
+          <w:rFonts w:ascii="Times New Roman" w:hAnsi="Times New Roman"/>
+          <w:b w:val="0"/>
+          <w:color w:val="1E1E1E"/>
+          <w:sz w:val="23"/>
+        </w:rPr>
+        <w:t>24</w:t>
+      </w:r>
+    </w:p>
+    <w:p>
+      <w:pPr>
+        <w:spacing w:before="40" w:after="40" w:line="276" w:lineRule="auto"/>
+        <w:tabs>
+          <w:tab w:val="right" w:leader="dot" w:pos="9070"/>
+        </w:tabs>
+        <w:ind w:left="720"/>
+      </w:pPr>
+      <w:r>
+        <w:rPr>
+          <w:rFonts w:ascii="Times New Roman" w:hAnsi="Times New Roman"/>
+          <w:b w:val="0"/>
+          <w:color w:val="1E1E1E"/>
+          <w:sz w:val="23"/>
+        </w:rPr>
+        <w:t>4.2.2. Dense Retrieval với BGE-M3 + FAISS</w:t>
+      </w:r>
+      <w:r>
+        <w:rPr>
+          <w:rFonts w:ascii="Times New Roman" w:hAnsi="Times New Roman"/>
+        </w:rPr>
+        <w:tab/>
+      </w:r>
+      <w:r>
+        <w:rPr>
+          <w:rFonts w:ascii="Times New Roman" w:hAnsi="Times New Roman"/>
+          <w:b w:val="0"/>
+          <w:color w:val="1E1E1E"/>
+          <w:sz w:val="23"/>
+        </w:rPr>
+        <w:t>24</w:t>
+      </w:r>
+    </w:p>
+    <w:p>
+      <w:pPr>
+        <w:spacing w:before="40" w:after="40" w:line="276" w:lineRule="auto"/>
+        <w:tabs>
+          <w:tab w:val="right" w:leader="dot" w:pos="9070"/>
+        </w:tabs>
+        <w:ind w:left="720"/>
+      </w:pPr>
+      <w:r>
+        <w:rPr>
+          <w:rFonts w:ascii="Times New Roman" w:hAnsi="Times New Roman"/>
+          <w:b w:val="0"/>
+          <w:color w:val="1E1E1E"/>
+          <w:sz w:val="23"/>
+        </w:rPr>
+        <w:t>4.2.3. Dung hợp thứ hạng nghịch đảo RRF</w:t>
+      </w:r>
+      <w:r>
+        <w:rPr>
+          <w:rFonts w:ascii="Times New Roman" w:hAnsi="Times New Roman"/>
+        </w:rPr>
+        <w:tab/>
+      </w:r>
+      <w:r>
+        <w:rPr>
+          <w:rFonts w:ascii="Times New Roman" w:hAnsi="Times New Roman"/>
+          <w:b w:val="0"/>
+          <w:color w:val="1E1E1E"/>
+          <w:sz w:val="23"/>
+        </w:rPr>
+        <w:t>25</w:t>
+      </w:r>
+    </w:p>
+    <w:p>
+      <w:pPr>
+        <w:spacing w:before="40" w:after="40" w:line="276" w:lineRule="auto"/>
+        <w:tabs>
+          <w:tab w:val="right" w:leader="dot" w:pos="9070"/>
+        </w:tabs>
+        <w:ind w:left="720"/>
+      </w:pPr>
+      <w:r>
+        <w:rPr>
+          <w:rFonts w:ascii="Times New Roman" w:hAnsi="Times New Roman"/>
+          <w:b w:val="0"/>
+          <w:color w:val="1E1E1E"/>
+          <w:sz w:val="23"/>
+        </w:rPr>
+        <w:t>4.2.4. Neural Cross-Encoder Reranking</w:t>
+      </w:r>
+      <w:r>
+        <w:rPr>
+          <w:rFonts w:ascii="Times New Roman" w:hAnsi="Times New Roman"/>
+        </w:rPr>
+        <w:tab/>
+      </w:r>
+      <w:r>
+        <w:rPr>
+          <w:rFonts w:ascii="Times New Roman" w:hAnsi="Times New Roman"/>
+          <w:b w:val="0"/>
+          <w:color w:val="1E1E1E"/>
+          <w:sz w:val="23"/>
+        </w:rPr>
+        <w:t>25</w:t>
+      </w:r>
+    </w:p>
+    <w:p>
+      <w:pPr>
+        <w:spacing w:before="40" w:after="40" w:line="276" w:lineRule="auto"/>
+        <w:tabs>
+          <w:tab w:val="right" w:leader="dot" w:pos="9070"/>
+        </w:tabs>
+        <w:ind w:left="360"/>
+      </w:pPr>
+      <w:r>
+        <w:rPr>
+          <w:rFonts w:ascii="Times New Roman" w:hAnsi="Times New Roman"/>
+          <w:b w:val="0"/>
+          <w:color w:val="1E1E1E"/>
+          <w:sz w:val="23"/>
+        </w:rPr>
+        <w:t>4.3. Mô-đun Phân loại phán quyết hai bước (Two-step Verdict Classification - TVC)</w:t>
+      </w:r>
+      <w:r>
+        <w:rPr>
+          <w:rFonts w:ascii="Times New Roman" w:hAnsi="Times New Roman"/>
+        </w:rPr>
+        <w:tab/>
+      </w:r>
+      <w:r>
+        <w:rPr>
+          <w:rFonts w:ascii="Times New Roman" w:hAnsi="Times New Roman"/>
+          <w:b w:val="0"/>
+          <w:color w:val="1E1E1E"/>
+          <w:sz w:val="23"/>
+        </w:rPr>
+        <w:t>26</w:t>
+      </w:r>
+    </w:p>
+    <w:p>
+      <w:pPr>
+        <w:spacing w:before="40" w:after="40" w:line="276" w:lineRule="auto"/>
+        <w:tabs>
+          <w:tab w:val="right" w:leader="dot" w:pos="9070"/>
+        </w:tabs>
+        <w:ind w:left="720"/>
+      </w:pPr>
+      <w:r>
+        <w:rPr>
+          <w:rFonts w:ascii="Times New Roman" w:hAnsi="Times New Roman"/>
+          <w:b w:val="0"/>
+          <w:color w:val="1E1E1E"/>
+          <w:sz w:val="23"/>
+        </w:rPr>
+        <w:t>4.3.1. Phân tích nguyên nhân thất bại phân loại 3 nhãn trực tiếp</w:t>
+      </w:r>
+      <w:r>
+        <w:rPr>
+          <w:rFonts w:ascii="Times New Roman" w:hAnsi="Times New Roman"/>
+        </w:rPr>
+        <w:tab/>
+      </w:r>
+      <w:r>
+        <w:rPr>
+          <w:rFonts w:ascii="Times New Roman" w:hAnsi="Times New Roman"/>
+          <w:b w:val="0"/>
+          <w:color w:val="1E1E1E"/>
+          <w:sz w:val="23"/>
+        </w:rPr>
+        <w:t>26</w:t>
+      </w:r>
+    </w:p>
+    <w:p>
+      <w:pPr>
+        <w:spacing w:before="40" w:after="40" w:line="276" w:lineRule="auto"/>
+        <w:tabs>
+          <w:tab w:val="right" w:leader="dot" w:pos="9070"/>
+        </w:tabs>
+        <w:ind w:left="720"/>
+      </w:pPr>
+      <w:r>
+        <w:rPr>
+          <w:rFonts w:ascii="Times New Roman" w:hAnsi="Times New Roman"/>
+          <w:b w:val="0"/>
+          <w:color w:val="1E1E1E"/>
+          <w:sz w:val="23"/>
+        </w:rPr>
+        <w:t>4.3.2. Bước 1: Bộ lọc tính đầy đủ (Sufficiency Filter)</w:t>
+      </w:r>
+      <w:r>
+        <w:rPr>
+          <w:rFonts w:ascii="Times New Roman" w:hAnsi="Times New Roman"/>
+        </w:rPr>
+        <w:tab/>
+      </w:r>
+      <w:r>
+        <w:rPr>
+          <w:rFonts w:ascii="Times New Roman" w:hAnsi="Times New Roman"/>
+          <w:b w:val="0"/>
+          <w:color w:val="1E1E1E"/>
+          <w:sz w:val="23"/>
+        </w:rPr>
+        <w:t>26</w:t>
+      </w:r>
+    </w:p>
+    <w:p>
+      <w:pPr>
+        <w:spacing w:before="40" w:after="40" w:line="276" w:lineRule="auto"/>
+        <w:tabs>
+          <w:tab w:val="right" w:leader="dot" w:pos="9070"/>
+        </w:tabs>
+        <w:ind w:left="720"/>
+      </w:pPr>
+      <w:r>
+        <w:rPr>
+          <w:rFonts w:ascii="Times New Roman" w:hAnsi="Times New Roman"/>
+          <w:b w:val="0"/>
+          <w:color w:val="1E1E1E"/>
+          <w:sz w:val="23"/>
+        </w:rPr>
+        <w:t>4.3.3. Bước 2: Xác minh lập trường (Stance Verification)</w:t>
+      </w:r>
+      <w:r>
+        <w:rPr>
+          <w:rFonts w:ascii="Times New Roman" w:hAnsi="Times New Roman"/>
+        </w:rPr>
+        <w:tab/>
+      </w:r>
+      <w:r>
+        <w:rPr>
+          <w:rFonts w:ascii="Times New Roman" w:hAnsi="Times New Roman"/>
+          <w:b w:val="0"/>
+          <w:color w:val="1E1E1E"/>
+          <w:sz w:val="23"/>
+        </w:rPr>
+        <w:t>27</w:t>
+      </w:r>
+    </w:p>
+    <w:p>
+      <w:pPr>
+        <w:spacing w:before="40" w:after="40" w:line="276" w:lineRule="auto"/>
+        <w:tabs>
+          <w:tab w:val="right" w:leader="dot" w:pos="9070"/>
+        </w:tabs>
+        <w:ind w:left="720"/>
+      </w:pPr>
+      <w:r>
+        <w:rPr>
+          <w:rFonts w:ascii="Times New Roman" w:hAnsi="Times New Roman"/>
+          <w:b w:val="0"/>
+          <w:color w:val="1E1E1E"/>
+          <w:sz w:val="23"/>
+        </w:rPr>
+        <w:t>4.3.4. Thiết kế kỹ nghệ Prompting Few-shot tiếng Việt</w:t>
+      </w:r>
+      <w:r>
+        <w:rPr>
+          <w:rFonts w:ascii="Times New Roman" w:hAnsi="Times New Roman"/>
+        </w:rPr>
+        <w:tab/>
+      </w:r>
+      <w:r>
+        <w:rPr>
+          <w:rFonts w:ascii="Times New Roman" w:hAnsi="Times New Roman"/>
+          <w:b w:val="0"/>
+          <w:color w:val="1E1E1E"/>
+          <w:sz w:val="23"/>
+        </w:rPr>
+        <w:t>27</w:t>
+      </w:r>
+    </w:p>
+    <w:p>
+      <w:pPr>
+        <w:spacing w:before="40" w:after="40" w:line="276" w:lineRule="auto"/>
+        <w:tabs>
+          <w:tab w:val="right" w:leader="dot" w:pos="9070"/>
+        </w:tabs>
+        <w:ind w:left="360"/>
+      </w:pPr>
+      <w:r>
+        <w:rPr>
+          <w:rFonts w:ascii="Times New Roman" w:hAnsi="Times New Roman"/>
+          <w:b w:val="0"/>
+          <w:color w:val="1E1E1E"/>
+          <w:sz w:val="23"/>
+        </w:rPr>
+        <w:t>4.4. Mô-đun RAG Rationale Generation và Trích xuất có cấu trúc (Pydantic)</w:t>
+      </w:r>
+      <w:r>
+        <w:rPr>
+          <w:rFonts w:ascii="Times New Roman" w:hAnsi="Times New Roman"/>
+        </w:rPr>
+        <w:tab/>
+      </w:r>
+      <w:r>
+        <w:rPr>
+          <w:rFonts w:ascii="Times New Roman" w:hAnsi="Times New Roman"/>
+          <w:b w:val="0"/>
+          <w:color w:val="1E1E1E"/>
+          <w:sz w:val="23"/>
+        </w:rPr>
+        <w:t>28</w:t>
+      </w:r>
+    </w:p>
+    <w:p>
+      <w:pPr>
+        <w:spacing w:before="40" w:after="40" w:line="276" w:lineRule="auto"/>
+        <w:tabs>
+          <w:tab w:val="right" w:leader="dot" w:pos="9070"/>
+        </w:tabs>
+      </w:pPr>
+      <w:r>
+        <w:rPr>
+          <w:rFonts w:ascii="Times New Roman" w:hAnsi="Times New Roman"/>
+          <w:b/>
+          <w:color w:val="1E1E1E"/>
+          <w:sz w:val="23"/>
+        </w:rPr>
+        <w:t>CHƯƠNG 5: KẾT QUẢ THỰC NGHIỆM VÀ ĐÁNH GIÁ</w:t>
+      </w:r>
+      <w:r>
+        <w:rPr>
+          <w:rFonts w:ascii="Times New Roman" w:hAnsi="Times New Roman"/>
+        </w:rPr>
+        <w:tab/>
+      </w:r>
+      <w:r>
+        <w:rPr>
+          <w:rFonts w:ascii="Times New Roman" w:hAnsi="Times New Roman"/>
+          <w:b/>
+          <w:color w:val="1E1E1E"/>
+          <w:sz w:val="23"/>
+        </w:rPr>
+        <w:t>30</w:t>
+      </w:r>
+    </w:p>
+    <w:p>
+      <w:pPr>
+        <w:spacing w:before="40" w:after="40" w:line="276" w:lineRule="auto"/>
+        <w:tabs>
+          <w:tab w:val="right" w:leader="dot" w:pos="9070"/>
+        </w:tabs>
+        <w:ind w:left="360"/>
+      </w:pPr>
+      <w:r>
+        <w:rPr>
+          <w:rFonts w:ascii="Times New Roman" w:hAnsi="Times New Roman"/>
+          <w:b w:val="0"/>
+          <w:color w:val="1E1E1E"/>
+          <w:sz w:val="23"/>
+        </w:rPr>
+        <w:t>5.1. Thiết lập thực nghiệm và Siêu tham số</w:t>
+      </w:r>
+      <w:r>
+        <w:rPr>
+          <w:rFonts w:ascii="Times New Roman" w:hAnsi="Times New Roman"/>
+        </w:rPr>
+        <w:tab/>
+      </w:r>
+      <w:r>
+        <w:rPr>
+          <w:rFonts w:ascii="Times New Roman" w:hAnsi="Times New Roman"/>
+          <w:b w:val="0"/>
+          <w:color w:val="1E1E1E"/>
+          <w:sz w:val="23"/>
+        </w:rPr>
+        <w:t>30</w:t>
+      </w:r>
+    </w:p>
+    <w:p>
+      <w:pPr>
+        <w:spacing w:before="40" w:after="40" w:line="276" w:lineRule="auto"/>
+        <w:tabs>
+          <w:tab w:val="right" w:leader="dot" w:pos="9070"/>
+        </w:tabs>
+        <w:ind w:left="360"/>
+      </w:pPr>
+      <w:r>
+        <w:rPr>
+          <w:rFonts w:ascii="Times New Roman" w:hAnsi="Times New Roman"/>
+          <w:b w:val="0"/>
+          <w:color w:val="1E1E1E"/>
+          <w:sz w:val="23"/>
+        </w:rPr>
+        <w:t>5.2. Kết quả đánh giá mô-đun Truy xuất bằng chứng (SER)</w:t>
+      </w:r>
+      <w:r>
+        <w:rPr>
+          <w:rFonts w:ascii="Times New Roman" w:hAnsi="Times New Roman"/>
+        </w:rPr>
+        <w:tab/>
+      </w:r>
+      <w:r>
+        <w:rPr>
+          <w:rFonts w:ascii="Times New Roman" w:hAnsi="Times New Roman"/>
+          <w:b w:val="0"/>
+          <w:color w:val="1E1E1E"/>
+          <w:sz w:val="23"/>
+        </w:rPr>
+        <w:t>31</w:t>
+      </w:r>
+    </w:p>
+    <w:p>
+      <w:pPr>
+        <w:spacing w:before="40" w:after="40" w:line="276" w:lineRule="auto"/>
+        <w:tabs>
+          <w:tab w:val="right" w:leader="dot" w:pos="9070"/>
+        </w:tabs>
+        <w:ind w:left="360"/>
+      </w:pPr>
+      <w:r>
+        <w:rPr>
+          <w:rFonts w:ascii="Times New Roman" w:hAnsi="Times New Roman"/>
+          <w:b w:val="0"/>
+          <w:color w:val="1E1E1E"/>
+          <w:sz w:val="23"/>
+        </w:rPr>
+        <w:t>5.3. Kết quả đánh giá mô-đun Phân loại phán quyết (TVC)</w:t>
+      </w:r>
+      <w:r>
+        <w:rPr>
+          <w:rFonts w:ascii="Times New Roman" w:hAnsi="Times New Roman"/>
+        </w:rPr>
+        <w:tab/>
+      </w:r>
+      <w:r>
+        <w:rPr>
+          <w:rFonts w:ascii="Times New Roman" w:hAnsi="Times New Roman"/>
+          <w:b w:val="0"/>
+          <w:color w:val="1E1E1E"/>
+          <w:sz w:val="23"/>
+        </w:rPr>
+        <w:t>32</w:t>
+      </w:r>
+    </w:p>
+    <w:p>
+      <w:pPr>
+        <w:spacing w:before="40" w:after="40" w:line="276" w:lineRule="auto"/>
+        <w:tabs>
+          <w:tab w:val="right" w:leader="dot" w:pos="9070"/>
+        </w:tabs>
+        <w:ind w:left="360"/>
+      </w:pPr>
+      <w:r>
+        <w:rPr>
+          <w:rFonts w:ascii="Times New Roman" w:hAnsi="Times New Roman"/>
+          <w:b w:val="0"/>
+          <w:color w:val="1E1E1E"/>
+          <w:sz w:val="23"/>
+        </w:rPr>
+        <w:t>5.4. Nghiên cứu thành phần (Ablation Study)</w:t>
+      </w:r>
+      <w:r>
+        <w:rPr>
+          <w:rFonts w:ascii="Times New Roman" w:hAnsi="Times New Roman"/>
+        </w:rPr>
+        <w:tab/>
+      </w:r>
+      <w:r>
+        <w:rPr>
+          <w:rFonts w:ascii="Times New Roman" w:hAnsi="Times New Roman"/>
+          <w:b w:val="0"/>
+          <w:color w:val="1E1E1E"/>
+          <w:sz w:val="23"/>
+        </w:rPr>
+        <w:t>33</w:t>
+      </w:r>
+    </w:p>
+    <w:p>
+      <w:pPr>
+        <w:spacing w:before="40" w:after="40" w:line="276" w:lineRule="auto"/>
+        <w:tabs>
+          <w:tab w:val="right" w:leader="dot" w:pos="9070"/>
+        </w:tabs>
+        <w:ind w:left="360"/>
+      </w:pPr>
+      <w:r>
+        <w:rPr>
+          <w:rFonts w:ascii="Times New Roman" w:hAnsi="Times New Roman"/>
+          <w:b w:val="0"/>
+          <w:color w:val="1E1E1E"/>
+          <w:sz w:val="23"/>
+        </w:rPr>
+        <w:t>5.5. So sánh hiệu quả các chiến lược kỹ nghệ Prompting</w:t>
+      </w:r>
+      <w:r>
+        <w:rPr>
+          <w:rFonts w:ascii="Times New Roman" w:hAnsi="Times New Roman"/>
+        </w:rPr>
+        <w:tab/>
+      </w:r>
+      <w:r>
+        <w:rPr>
+          <w:rFonts w:ascii="Times New Roman" w:hAnsi="Times New Roman"/>
+          <w:b w:val="0"/>
+          <w:color w:val="1E1E1E"/>
+          <w:sz w:val="23"/>
+        </w:rPr>
+        <w:t>34</w:t>
+      </w:r>
+    </w:p>
+    <w:p>
+      <w:pPr>
+        <w:spacing w:before="40" w:after="40" w:line="276" w:lineRule="auto"/>
+        <w:tabs>
+          <w:tab w:val="right" w:leader="dot" w:pos="9070"/>
+        </w:tabs>
+        <w:ind w:left="360"/>
+      </w:pPr>
+      <w:r>
+        <w:rPr>
+          <w:rFonts w:ascii="Times New Roman" w:hAnsi="Times New Roman"/>
+          <w:b w:val="0"/>
+          <w:color w:val="1E1E1E"/>
+          <w:sz w:val="23"/>
+        </w:rPr>
+        <w:t>5.6. Phân tích định tính và Nghiên cứu trường hợp điển hình (Case Studies)</w:t>
+      </w:r>
+      <w:r>
+        <w:rPr>
+          <w:rFonts w:ascii="Times New Roman" w:hAnsi="Times New Roman"/>
+        </w:rPr>
+        <w:tab/>
+      </w:r>
+      <w:r>
+        <w:rPr>
+          <w:rFonts w:ascii="Times New Roman" w:hAnsi="Times New Roman"/>
+          <w:b w:val="0"/>
+          <w:color w:val="1E1E1E"/>
+          <w:sz w:val="23"/>
+        </w:rPr>
+        <w:t>35</w:t>
+      </w:r>
+    </w:p>
+    <w:p>
+      <w:pPr>
+        <w:spacing w:before="40" w:after="40" w:line="276" w:lineRule="auto"/>
+        <w:tabs>
+          <w:tab w:val="right" w:leader="dot" w:pos="9070"/>
+        </w:tabs>
+        <w:ind w:left="720"/>
+      </w:pPr>
+      <w:r>
+        <w:rPr>
+          <w:rFonts w:ascii="Times New Roman" w:hAnsi="Times New Roman"/>
+          <w:b w:val="0"/>
+          <w:color w:val="1E1E1E"/>
+          <w:sz w:val="23"/>
+        </w:rPr>
+        <w:t>5.6.1. Ca 1: Phán quyết SUPPORTED (Kiểm chứng tri thức bách khoa)</w:t>
+      </w:r>
+      <w:r>
+        <w:rPr>
+          <w:rFonts w:ascii="Times New Roman" w:hAnsi="Times New Roman"/>
+        </w:rPr>
+        <w:tab/>
+      </w:r>
+      <w:r>
+        <w:rPr>
+          <w:rFonts w:ascii="Times New Roman" w:hAnsi="Times New Roman"/>
+          <w:b w:val="0"/>
+          <w:color w:val="1E1E1E"/>
+          <w:sz w:val="23"/>
+        </w:rPr>
+        <w:t>35</w:t>
+      </w:r>
+    </w:p>
+    <w:p>
+      <w:pPr>
+        <w:spacing w:before="40" w:after="40" w:line="276" w:lineRule="auto"/>
+        <w:tabs>
+          <w:tab w:val="right" w:leader="dot" w:pos="9070"/>
+        </w:tabs>
+        <w:ind w:left="720"/>
+      </w:pPr>
+      <w:r>
+        <w:rPr>
+          <w:rFonts w:ascii="Times New Roman" w:hAnsi="Times New Roman"/>
+          <w:b w:val="0"/>
+          <w:color w:val="1E1E1E"/>
+          <w:sz w:val="23"/>
+        </w:rPr>
+        <w:t>5.6.2. Ca 2: Phán quyết REFUTED (Phát hiện tin xuyên tạc sự thật)</w:t>
+      </w:r>
+      <w:r>
+        <w:rPr>
+          <w:rFonts w:ascii="Times New Roman" w:hAnsi="Times New Roman"/>
+        </w:rPr>
+        <w:tab/>
+      </w:r>
+      <w:r>
+        <w:rPr>
+          <w:rFonts w:ascii="Times New Roman" w:hAnsi="Times New Roman"/>
+          <w:b w:val="0"/>
+          <w:color w:val="1E1E1E"/>
+          <w:sz w:val="23"/>
+        </w:rPr>
+        <w:t>35</w:t>
+      </w:r>
+    </w:p>
+    <w:p>
+      <w:pPr>
+        <w:spacing w:before="40" w:after="40" w:line="276" w:lineRule="auto"/>
+        <w:tabs>
+          <w:tab w:val="right" w:leader="dot" w:pos="9070"/>
+        </w:tabs>
+        <w:ind w:left="720"/>
+      </w:pPr>
+      <w:r>
+        <w:rPr>
+          <w:rFonts w:ascii="Times New Roman" w:hAnsi="Times New Roman"/>
+          <w:b w:val="0"/>
+          <w:color w:val="1E1E1E"/>
+          <w:sz w:val="23"/>
+        </w:rPr>
+        <w:t>5.6.3. Ca 3: Phán quyết NOT ENOUGH INFO (Lọc thiếu căn cứ)</w:t>
+      </w:r>
+      <w:r>
+        <w:rPr>
+          <w:rFonts w:ascii="Times New Roman" w:hAnsi="Times New Roman"/>
+        </w:rPr>
+        <w:tab/>
+      </w:r>
+      <w:r>
+        <w:rPr>
+          <w:rFonts w:ascii="Times New Roman" w:hAnsi="Times New Roman"/>
+          <w:b w:val="0"/>
+          <w:color w:val="1E1E1E"/>
+          <w:sz w:val="23"/>
+        </w:rPr>
+        <w:t>36</w:t>
+      </w:r>
+    </w:p>
+    <w:p>
+      <w:pPr>
+        <w:spacing w:before="40" w:after="40" w:line="276" w:lineRule="auto"/>
+        <w:tabs>
+          <w:tab w:val="right" w:leader="dot" w:pos="9070"/>
+        </w:tabs>
+        <w:ind w:left="720"/>
+      </w:pPr>
+      <w:r>
+        <w:rPr>
+          <w:rFonts w:ascii="Times New Roman" w:hAnsi="Times New Roman"/>
+          <w:b w:val="0"/>
+          <w:color w:val="1E1E1E"/>
+          <w:sz w:val="23"/>
+        </w:rPr>
+        <w:t>5.6.4. Ca 4: Phân tích sai sót (Error Analysis)</w:t>
+      </w:r>
+      <w:r>
+        <w:rPr>
+          <w:rFonts w:ascii="Times New Roman" w:hAnsi="Times New Roman"/>
+        </w:rPr>
+        <w:tab/>
+      </w:r>
+      <w:r>
+        <w:rPr>
+          <w:rFonts w:ascii="Times New Roman" w:hAnsi="Times New Roman"/>
+          <w:b w:val="0"/>
+          <w:color w:val="1E1E1E"/>
+          <w:sz w:val="23"/>
+        </w:rPr>
+        <w:t>36</w:t>
+      </w:r>
+    </w:p>
+    <w:p>
+      <w:pPr>
+        <w:spacing w:before="40" w:after="40" w:line="276" w:lineRule="auto"/>
+        <w:tabs>
+          <w:tab w:val="right" w:leader="dot" w:pos="9070"/>
+        </w:tabs>
+      </w:pPr>
+      <w:r>
+        <w:rPr>
+          <w:rFonts w:ascii="Times New Roman" w:hAnsi="Times New Roman"/>
+          <w:b/>
+          <w:color w:val="1E1E1E"/>
+          <w:sz w:val="23"/>
+        </w:rPr>
+        <w:t>CHƯƠNG 6: KẾT LUẬN VÀ HƯỚNG PHÁT TRIỂN</w:t>
+      </w:r>
+      <w:r>
+        <w:rPr>
+          <w:rFonts w:ascii="Times New Roman" w:hAnsi="Times New Roman"/>
+        </w:rPr>
+        <w:tab/>
+      </w:r>
+      <w:r>
+        <w:rPr>
+          <w:rFonts w:ascii="Times New Roman" w:hAnsi="Times New Roman"/>
+          <w:b/>
+          <w:color w:val="1E1E1E"/>
+          <w:sz w:val="23"/>
+        </w:rPr>
+        <w:t>38</w:t>
+      </w:r>
+    </w:p>
+    <w:p>
+      <w:pPr>
+        <w:spacing w:before="40" w:after="40" w:line="276" w:lineRule="auto"/>
+        <w:tabs>
+          <w:tab w:val="right" w:leader="dot" w:pos="9070"/>
+        </w:tabs>
+        <w:ind w:left="360"/>
+      </w:pPr>
+      <w:r>
+        <w:rPr>
+          <w:rFonts w:ascii="Times New Roman" w:hAnsi="Times New Roman"/>
+          <w:b w:val="0"/>
+          <w:color w:val="1E1E1E"/>
+          <w:sz w:val="23"/>
+        </w:rPr>
+        <w:t>6.1. Kết luận</w:t>
+      </w:r>
+      <w:r>
+        <w:rPr>
+          <w:rFonts w:ascii="Times New Roman" w:hAnsi="Times New Roman"/>
+        </w:rPr>
+        <w:tab/>
+      </w:r>
+      <w:r>
+        <w:rPr>
+          <w:rFonts w:ascii="Times New Roman" w:hAnsi="Times New Roman"/>
+          <w:b w:val="0"/>
+          <w:color w:val="1E1E1E"/>
+          <w:sz w:val="23"/>
+        </w:rPr>
+        <w:t>38</w:t>
+      </w:r>
+    </w:p>
+    <w:p>
+      <w:pPr>
+        <w:spacing w:before="40" w:after="40" w:line="276" w:lineRule="auto"/>
+        <w:tabs>
+          <w:tab w:val="right" w:leader="dot" w:pos="9070"/>
+        </w:tabs>
+        <w:ind w:left="360"/>
+      </w:pPr>
+      <w:r>
+        <w:rPr>
+          <w:rFonts w:ascii="Times New Roman" w:hAnsi="Times New Roman"/>
+          <w:b w:val="0"/>
+          <w:color w:val="1E1E1E"/>
+          <w:sz w:val="23"/>
+        </w:rPr>
+        <w:t>6.2. Hạn chế</w:t>
+      </w:r>
+      <w:r>
+        <w:rPr>
+          <w:rFonts w:ascii="Times New Roman" w:hAnsi="Times New Roman"/>
+        </w:rPr>
+        <w:tab/>
+      </w:r>
+      <w:r>
+        <w:rPr>
+          <w:rFonts w:ascii="Times New Roman" w:hAnsi="Times New Roman"/>
+          <w:b w:val="0"/>
+          <w:color w:val="1E1E1E"/>
+          <w:sz w:val="23"/>
+        </w:rPr>
+        <w:t>38</w:t>
+      </w:r>
+    </w:p>
+    <w:p>
+      <w:pPr>
+        <w:spacing w:before="40" w:after="40" w:line="276" w:lineRule="auto"/>
+        <w:tabs>
+          <w:tab w:val="right" w:leader="dot" w:pos="9070"/>
+        </w:tabs>
+        <w:ind w:left="360"/>
+      </w:pPr>
+      <w:r>
+        <w:rPr>
+          <w:rFonts w:ascii="Times New Roman" w:hAnsi="Times New Roman"/>
+          <w:b w:val="0"/>
+          <w:color w:val="1E1E1E"/>
+          <w:sz w:val="23"/>
+        </w:rPr>
+        <w:t>6.3. Hướng phát triển trong tương lai</w:t>
+      </w:r>
+      <w:r>
+        <w:rPr>
+          <w:rFonts w:ascii="Times New Roman" w:hAnsi="Times New Roman"/>
+        </w:rPr>
+        <w:tab/>
+      </w:r>
+      <w:r>
+        <w:rPr>
+          <w:rFonts w:ascii="Times New Roman" w:hAnsi="Times New Roman"/>
+          <w:b w:val="0"/>
+          <w:color w:val="1E1E1E"/>
+          <w:sz w:val="23"/>
+        </w:rPr>
+        <w:t>39</w:t>
+      </w:r>
+    </w:p>
+    <w:p>
+      <w:pPr>
+        <w:spacing w:before="40" w:after="40" w:line="276" w:lineRule="auto"/>
+        <w:tabs>
+          <w:tab w:val="right" w:leader="dot" w:pos="9070"/>
+        </w:tabs>
+      </w:pPr>
+      <w:r>
+        <w:rPr>
+          <w:rFonts w:ascii="Times New Roman" w:hAnsi="Times New Roman"/>
+          <w:b/>
+          <w:color w:val="1E1E1E"/>
+          <w:sz w:val="23"/>
+        </w:rPr>
+        <w:t>TÀI LIỆU THAM KHẢO</w:t>
+      </w:r>
+      <w:r>
+        <w:rPr>
+          <w:rFonts w:ascii="Times New Roman" w:hAnsi="Times New Roman"/>
+        </w:rPr>
+        <w:tab/>
+      </w:r>
+      <w:r>
+        <w:rPr>
+          <w:rFonts w:ascii="Times New Roman" w:hAnsi="Times New Roman"/>
+          <w:b/>
+          <w:color w:val="1E1E1E"/>
+          <w:sz w:val="23"/>
+        </w:rPr>
+        <w:t>40</w:t>
+      </w:r>
+    </w:p>
+    <w:p>
+      <w:pPr>
+        <w:spacing w:before="40" w:after="40" w:line="276" w:lineRule="auto"/>
+        <w:tabs>
+          <w:tab w:val="right" w:leader="dot" w:pos="9070"/>
+        </w:tabs>
+      </w:pPr>
+      <w:r>
+        <w:rPr>
+          <w:rFonts w:ascii="Times New Roman" w:hAnsi="Times New Roman"/>
+          <w:b/>
+          <w:color w:val="1E1E1E"/>
+          <w:sz w:val="23"/>
+        </w:rPr>
+        <w:t>PHỤ LỤC</w:t>
+      </w:r>
+      <w:r>
+        <w:rPr>
+          <w:rFonts w:ascii="Times New Roman" w:hAnsi="Times New Roman"/>
+        </w:rPr>
+        <w:tab/>
+      </w:r>
+      <w:r>
+        <w:rPr>
+          <w:rFonts w:ascii="Times New Roman" w:hAnsi="Times New Roman"/>
+          <w:b/>
+          <w:color w:val="1E1E1E"/>
+          <w:sz w:val="23"/>
+        </w:rPr>
+        <w:t>42</w:t>
       </w:r>
     </w:p>
     <w:p>
@@ -22878,2328 +25271,6 @@
       <w:pgNumType w:fmt="lowerRoman" w:start="1"/>
       <w:pgNumType w:start="1"/>
     </w:sectPr>
-    <w:sdt>
-      <w:sdtPr>
-        <w:docPartObj>
-          <w:docPartGallery w:val="Table of Contents"/>
-          <w:docPartUnique/>
-        </w:docPartObj>
-      </w:sdtPr>
-      <w:sdtContent>
-        <w:p>
-          <w:pPr>
-            <w:pStyle w:val="TOCHeading"/>
-          </w:pPr>
-          <w:r>
-            <w:fldChar w:fldCharType="begin"/>
-          </w:r>
-          <w:instrText xml:space="preserve"> TOC \o "1-3" \h \z \u </w:instrText>
-          <w:r>
-            <w:fldChar w:fldCharType="separate"/>
-          </w:r>
-        </w:p>
-        <w:p>
-          <w:pPr>
-            <w:pStyle w:val="TOC1"/>
-            <w:tabs>
-              <w:tab w:val="right" w:leader="dot" w:pos="9070"/>
-            </w:tabs>
-            <w:ind w:left="0"/>
-            <w:spacing w:before="24" w:after="24" w:line="240" w:lineRule="auto"/>
-          </w:pPr>
-          <w:r>
-            <w:rPr>
-              <w:rFonts w:ascii="Times New Roman" w:hAnsi="Times New Roman" w:cs="Times New Roman"/>
-              <w:b/>
-              <w:sz w:val="24"/>
-            </w:rPr>
-            <w:t>LỜI CAM ĐOAN</w:t>
-          </w:r>
-          <w:r>
-            <w:rPr>
-              <w:rFonts w:ascii="Times New Roman" w:hAnsi="Times New Roman" w:cs="Times New Roman"/>
-              <w:sz w:val="24"/>
-            </w:rPr>
-            <w:tab/>
-          </w:r>
-          <w:r>
-            <w:rPr>
-              <w:rFonts w:ascii="Times New Roman" w:hAnsi="Times New Roman" w:cs="Times New Roman"/>
-              <w:b/>
-              <w:sz w:val="24"/>
-            </w:rPr>
-            <w:t>i</w:t>
-          </w:r>
-        </w:p>
-        <w:p>
-          <w:pPr>
-            <w:pStyle w:val="TOC1"/>
-            <w:tabs>
-              <w:tab w:val="right" w:leader="dot" w:pos="9070"/>
-            </w:tabs>
-            <w:ind w:left="0"/>
-            <w:spacing w:before="24" w:after="24" w:line="240" w:lineRule="auto"/>
-          </w:pPr>
-          <w:r>
-            <w:rPr>
-              <w:rFonts w:ascii="Times New Roman" w:hAnsi="Times New Roman" w:cs="Times New Roman"/>
-              <w:b/>
-              <w:sz w:val="24"/>
-            </w:rPr>
-            <w:t>LỜI CẢM ƠN</w:t>
-          </w:r>
-          <w:r>
-            <w:rPr>
-              <w:rFonts w:ascii="Times New Roman" w:hAnsi="Times New Roman" w:cs="Times New Roman"/>
-              <w:sz w:val="24"/>
-            </w:rPr>
-            <w:tab/>
-          </w:r>
-          <w:r>
-            <w:rPr>
-              <w:rFonts w:ascii="Times New Roman" w:hAnsi="Times New Roman" w:cs="Times New Roman"/>
-              <w:b/>
-              <w:sz w:val="24"/>
-            </w:rPr>
-            <w:t>ii</w:t>
-          </w:r>
-        </w:p>
-        <w:p>
-          <w:pPr>
-            <w:pStyle w:val="TOC1"/>
-            <w:tabs>
-              <w:tab w:val="right" w:leader="dot" w:pos="9070"/>
-            </w:tabs>
-            <w:ind w:left="0"/>
-            <w:spacing w:before="24" w:after="24" w:line="240" w:lineRule="auto"/>
-          </w:pPr>
-          <w:r>
-            <w:rPr>
-              <w:rFonts w:ascii="Times New Roman" w:hAnsi="Times New Roman" w:cs="Times New Roman"/>
-              <w:b/>
-              <w:sz w:val="24"/>
-            </w:rPr>
-            <w:t>NHẬN XÉT CỦA GIẢNG VIÊN HƯỚNG DẪN</w:t>
-          </w:r>
-          <w:r>
-            <w:rPr>
-              <w:rFonts w:ascii="Times New Roman" w:hAnsi="Times New Roman" w:cs="Times New Roman"/>
-              <w:sz w:val="24"/>
-            </w:rPr>
-            <w:tab/>
-          </w:r>
-          <w:r>
-            <w:rPr>
-              <w:rFonts w:ascii="Times New Roman" w:hAnsi="Times New Roman" w:cs="Times New Roman"/>
-              <w:b/>
-              <w:sz w:val="24"/>
-            </w:rPr>
-            <w:t>iii</w:t>
-          </w:r>
-        </w:p>
-        <w:p>
-          <w:pPr>
-            <w:pStyle w:val="TOC1"/>
-            <w:tabs>
-              <w:tab w:val="right" w:leader="dot" w:pos="9070"/>
-            </w:tabs>
-            <w:ind w:left="0"/>
-            <w:spacing w:before="24" w:after="24" w:line="240" w:lineRule="auto"/>
-          </w:pPr>
-          <w:r>
-            <w:rPr>
-              <w:rFonts w:ascii="Times New Roman" w:hAnsi="Times New Roman" w:cs="Times New Roman"/>
-              <w:b/>
-              <w:sz w:val="24"/>
-            </w:rPr>
-            <w:t>BẢNG PHÂN CÔNG CÔNG VIỆC VÀ ĐÓNG GÓP THÀNH VIÊN</w:t>
-          </w:r>
-          <w:r>
-            <w:rPr>
-              <w:rFonts w:ascii="Times New Roman" w:hAnsi="Times New Roman" w:cs="Times New Roman"/>
-              <w:sz w:val="24"/>
-            </w:rPr>
-            <w:tab/>
-          </w:r>
-          <w:r>
-            <w:rPr>
-              <w:rFonts w:ascii="Times New Roman" w:hAnsi="Times New Roman" w:cs="Times New Roman"/>
-              <w:b/>
-              <w:sz w:val="24"/>
-            </w:rPr>
-            <w:t>iv</w:t>
-          </w:r>
-        </w:p>
-        <w:p>
-          <w:pPr>
-            <w:pStyle w:val="TOC1"/>
-            <w:tabs>
-              <w:tab w:val="right" w:leader="dot" w:pos="9070"/>
-            </w:tabs>
-            <w:ind w:left="0"/>
-            <w:spacing w:before="24" w:after="24" w:line="240" w:lineRule="auto"/>
-          </w:pPr>
-          <w:r>
-            <w:rPr>
-              <w:rFonts w:ascii="Times New Roman" w:hAnsi="Times New Roman" w:cs="Times New Roman"/>
-              <w:b/>
-              <w:sz w:val="24"/>
-            </w:rPr>
-            <w:t>TÓM TẮT ĐỀ TÀI / ABSTRACT</w:t>
-          </w:r>
-          <w:r>
-            <w:rPr>
-              <w:rFonts w:ascii="Times New Roman" w:hAnsi="Times New Roman" w:cs="Times New Roman"/>
-              <w:sz w:val="24"/>
-            </w:rPr>
-            <w:tab/>
-          </w:r>
-          <w:r>
-            <w:rPr>
-              <w:rFonts w:ascii="Times New Roman" w:hAnsi="Times New Roman" w:cs="Times New Roman"/>
-              <w:b/>
-              <w:sz w:val="24"/>
-            </w:rPr>
-            <w:t>v</w:t>
-          </w:r>
-        </w:p>
-        <w:p>
-          <w:pPr>
-            <w:pStyle w:val="TOC1"/>
-            <w:tabs>
-              <w:tab w:val="right" w:leader="dot" w:pos="9070"/>
-            </w:tabs>
-            <w:ind w:left="0"/>
-            <w:spacing w:before="24" w:after="24" w:line="240" w:lineRule="auto"/>
-          </w:pPr>
-          <w:r>
-            <w:rPr>
-              <w:rFonts w:ascii="Times New Roman" w:hAnsi="Times New Roman" w:cs="Times New Roman"/>
-              <w:b/>
-              <w:sz w:val="24"/>
-            </w:rPr>
-            <w:t>DANH MỤC THUẬT NGỮ VÀ TỪ VIẾT TẮT</w:t>
-          </w:r>
-          <w:r>
-            <w:rPr>
-              <w:rFonts w:ascii="Times New Roman" w:hAnsi="Times New Roman" w:cs="Times New Roman"/>
-              <w:sz w:val="24"/>
-            </w:rPr>
-            <w:tab/>
-          </w:r>
-          <w:r>
-            <w:rPr>
-              <w:rFonts w:ascii="Times New Roman" w:hAnsi="Times New Roman" w:cs="Times New Roman"/>
-              <w:b/>
-              <w:sz w:val="24"/>
-            </w:rPr>
-            <w:t>vii</w:t>
-          </w:r>
-        </w:p>
-        <w:p>
-          <w:pPr>
-            <w:pStyle w:val="TOC1"/>
-            <w:tabs>
-              <w:tab w:val="right" w:leader="dot" w:pos="9070"/>
-            </w:tabs>
-            <w:ind w:left="0"/>
-            <w:spacing w:before="24" w:after="24" w:line="240" w:lineRule="auto"/>
-          </w:pPr>
-          <w:r>
-            <w:rPr>
-              <w:rFonts w:ascii="Times New Roman" w:hAnsi="Times New Roman" w:cs="Times New Roman"/>
-              <w:b/>
-              <w:sz w:val="24"/>
-            </w:rPr>
-            <w:t>DANH MỤC HÌNH ẢNH</w:t>
-          </w:r>
-          <w:r>
-            <w:rPr>
-              <w:rFonts w:ascii="Times New Roman" w:hAnsi="Times New Roman" w:cs="Times New Roman"/>
-              <w:sz w:val="24"/>
-            </w:rPr>
-            <w:tab/>
-          </w:r>
-          <w:r>
-            <w:rPr>
-              <w:rFonts w:ascii="Times New Roman" w:hAnsi="Times New Roman" w:cs="Times New Roman"/>
-              <w:b/>
-              <w:sz w:val="24"/>
-            </w:rPr>
-            <w:t>viii</w:t>
-          </w:r>
-        </w:p>
-        <w:p>
-          <w:pPr>
-            <w:pStyle w:val="TOC1"/>
-            <w:tabs>
-              <w:tab w:val="right" w:leader="dot" w:pos="9070"/>
-            </w:tabs>
-            <w:ind w:left="0"/>
-            <w:spacing w:before="24" w:after="24" w:line="240" w:lineRule="auto"/>
-          </w:pPr>
-          <w:r>
-            <w:rPr>
-              <w:rFonts w:ascii="Times New Roman" w:hAnsi="Times New Roman" w:cs="Times New Roman"/>
-              <w:b/>
-              <w:sz w:val="24"/>
-            </w:rPr>
-            <w:t>DANH MỤC BẢNG BIỂU</w:t>
-          </w:r>
-          <w:r>
-            <w:rPr>
-              <w:rFonts w:ascii="Times New Roman" w:hAnsi="Times New Roman" w:cs="Times New Roman"/>
-              <w:sz w:val="24"/>
-            </w:rPr>
-            <w:tab/>
-          </w:r>
-          <w:r>
-            <w:rPr>
-              <w:rFonts w:ascii="Times New Roman" w:hAnsi="Times New Roman" w:cs="Times New Roman"/>
-              <w:b/>
-              <w:sz w:val="24"/>
-            </w:rPr>
-            <w:t>ix</w:t>
-          </w:r>
-        </w:p>
-        <w:p>
-          <w:pPr>
-            <w:pStyle w:val="TOC1"/>
-            <w:tabs>
-              <w:tab w:val="right" w:leader="dot" w:pos="9070"/>
-            </w:tabs>
-            <w:ind w:left="0"/>
-            <w:spacing w:before="24" w:after="24" w:line="240" w:lineRule="auto"/>
-          </w:pPr>
-          <w:r>
-            <w:rPr>
-              <w:rFonts w:ascii="Times New Roman" w:hAnsi="Times New Roman" w:cs="Times New Roman"/>
-              <w:b/>
-              <w:sz w:val="24"/>
-            </w:rPr>
-            <w:t>CHƯƠNG 1: MỞ ĐẦU</w:t>
-          </w:r>
-          <w:r>
-            <w:rPr>
-              <w:rFonts w:ascii="Times New Roman" w:hAnsi="Times New Roman" w:cs="Times New Roman"/>
-              <w:sz w:val="24"/>
-            </w:rPr>
-            <w:tab/>
-          </w:r>
-          <w:r>
-            <w:rPr>
-              <w:rFonts w:ascii="Times New Roman" w:hAnsi="Times New Roman" w:cs="Times New Roman"/>
-              <w:b/>
-              <w:sz w:val="24"/>
-            </w:rPr>
-            <w:t>1</w:t>
-          </w:r>
-        </w:p>
-        <w:p>
-          <w:pPr>
-            <w:pStyle w:val="TOC2"/>
-            <w:tabs>
-              <w:tab w:val="right" w:leader="dot" w:pos="9070"/>
-            </w:tabs>
-            <w:ind w:left="360"/>
-            <w:spacing w:before="24" w:after="24" w:line="240" w:lineRule="auto"/>
-          </w:pPr>
-          <w:r>
-            <w:rPr>
-              <w:rFonts w:ascii="Times New Roman" w:hAnsi="Times New Roman" w:cs="Times New Roman"/>
-              <w:sz w:val="23"/>
-            </w:rPr>
-            <w:t>1.1. Bối cảnh và Tính cấp thiết của đề tài</w:t>
-          </w:r>
-          <w:r>
-            <w:rPr>
-              <w:rFonts w:ascii="Times New Roman" w:hAnsi="Times New Roman" w:cs="Times New Roman"/>
-              <w:sz w:val="23"/>
-            </w:rPr>
-            <w:tab/>
-          </w:r>
-          <w:r>
-            <w:rPr>
-              <w:rFonts w:ascii="Times New Roman" w:hAnsi="Times New Roman" w:cs="Times New Roman"/>
-              <w:sz w:val="23"/>
-            </w:rPr>
-            <w:t>1</w:t>
-          </w:r>
-        </w:p>
-        <w:p>
-          <w:pPr>
-            <w:pStyle w:val="TOC2"/>
-            <w:tabs>
-              <w:tab w:val="right" w:leader="dot" w:pos="9070"/>
-            </w:tabs>
-            <w:ind w:left="360"/>
-            <w:spacing w:before="24" w:after="24" w:line="240" w:lineRule="auto"/>
-          </w:pPr>
-          <w:r>
-            <w:rPr>
-              <w:rFonts w:ascii="Times New Roman" w:hAnsi="Times New Roman" w:cs="Times New Roman"/>
-              <w:sz w:val="23"/>
-            </w:rPr>
-            <w:t>1.2. Phân định bản chất khoa học: Phát hiện tin giả vs. Kiểm chứng thông tin</w:t>
-          </w:r>
-          <w:r>
-            <w:rPr>
-              <w:rFonts w:ascii="Times New Roman" w:hAnsi="Times New Roman" w:cs="Times New Roman"/>
-              <w:sz w:val="23"/>
-            </w:rPr>
-            <w:tab/>
-          </w:r>
-          <w:r>
-            <w:rPr>
-              <w:rFonts w:ascii="Times New Roman" w:hAnsi="Times New Roman" w:cs="Times New Roman"/>
-              <w:sz w:val="23"/>
-            </w:rPr>
-            <w:t>2</w:t>
-          </w:r>
-        </w:p>
-        <w:p>
-          <w:pPr>
-            <w:pStyle w:val="TOC2"/>
-            <w:tabs>
-              <w:tab w:val="right" w:leader="dot" w:pos="9070"/>
-            </w:tabs>
-            <w:ind w:left="360"/>
-            <w:spacing w:before="24" w:after="24" w:line="240" w:lineRule="auto"/>
-          </w:pPr>
-          <w:r>
-            <w:rPr>
-              <w:rFonts w:ascii="Times New Roman" w:hAnsi="Times New Roman" w:cs="Times New Roman"/>
-              <w:sz w:val="23"/>
-            </w:rPr>
-            <w:t>1.3. Mục tiêu nghiên cứu</w:t>
-          </w:r>
-          <w:r>
-            <w:rPr>
-              <w:rFonts w:ascii="Times New Roman" w:hAnsi="Times New Roman" w:cs="Times New Roman"/>
-              <w:sz w:val="23"/>
-            </w:rPr>
-            <w:tab/>
-          </w:r>
-          <w:r>
-            <w:rPr>
-              <w:rFonts w:ascii="Times New Roman" w:hAnsi="Times New Roman" w:cs="Times New Roman"/>
-              <w:sz w:val="23"/>
-            </w:rPr>
-            <w:t>3</w:t>
-          </w:r>
-        </w:p>
-        <w:p>
-          <w:pPr>
-            <w:pStyle w:val="TOC3"/>
-            <w:tabs>
-              <w:tab w:val="right" w:leader="dot" w:pos="9070"/>
-            </w:tabs>
-            <w:ind w:left="720"/>
-            <w:spacing w:before="24" w:after="24" w:line="240" w:lineRule="auto"/>
-          </w:pPr>
-          <w:r>
-            <w:rPr>
-              <w:rFonts w:ascii="Times New Roman" w:hAnsi="Times New Roman" w:cs="Times New Roman"/>
-              <w:sz w:val="23"/>
-            </w:rPr>
-            <w:t>1.3.1. Mục tiêu khoa học</w:t>
-          </w:r>
-          <w:r>
-            <w:rPr>
-              <w:rFonts w:ascii="Times New Roman" w:hAnsi="Times New Roman" w:cs="Times New Roman"/>
-              <w:sz w:val="23"/>
-            </w:rPr>
-            <w:tab/>
-          </w:r>
-          <w:r>
-            <w:rPr>
-              <w:rFonts w:ascii="Times New Roman" w:hAnsi="Times New Roman" w:cs="Times New Roman"/>
-              <w:sz w:val="23"/>
-            </w:rPr>
-            <w:t>3</w:t>
-          </w:r>
-        </w:p>
-        <w:p>
-          <w:pPr>
-            <w:pStyle w:val="TOC3"/>
-            <w:tabs>
-              <w:tab w:val="right" w:leader="dot" w:pos="9070"/>
-            </w:tabs>
-            <w:ind w:left="720"/>
-            <w:spacing w:before="24" w:after="24" w:line="240" w:lineRule="auto"/>
-          </w:pPr>
-          <w:r>
-            <w:rPr>
-              <w:rFonts w:ascii="Times New Roman" w:hAnsi="Times New Roman" w:cs="Times New Roman"/>
-              <w:sz w:val="23"/>
-            </w:rPr>
-            <w:t>1.3.2. Mục tiêu thực tiễn</w:t>
-          </w:r>
-          <w:r>
-            <w:rPr>
-              <w:rFonts w:ascii="Times New Roman" w:hAnsi="Times New Roman" w:cs="Times New Roman"/>
-              <w:sz w:val="23"/>
-            </w:rPr>
-            <w:tab/>
-          </w:r>
-          <w:r>
-            <w:rPr>
-              <w:rFonts w:ascii="Times New Roman" w:hAnsi="Times New Roman" w:cs="Times New Roman"/>
-              <w:sz w:val="23"/>
-            </w:rPr>
-            <w:t>4</w:t>
-          </w:r>
-        </w:p>
-        <w:p>
-          <w:pPr>
-            <w:pStyle w:val="TOC2"/>
-            <w:tabs>
-              <w:tab w:val="right" w:leader="dot" w:pos="9070"/>
-            </w:tabs>
-            <w:ind w:left="360"/>
-            <w:spacing w:before="24" w:after="24" w:line="240" w:lineRule="auto"/>
-          </w:pPr>
-          <w:r>
-            <w:rPr>
-              <w:rFonts w:ascii="Times New Roman" w:hAnsi="Times New Roman" w:cs="Times New Roman"/>
-              <w:sz w:val="23"/>
-            </w:rPr>
-            <w:t>1.4. Đối tượng và Phạm vi nghiên cứu</w:t>
-          </w:r>
-          <w:r>
-            <w:rPr>
-              <w:rFonts w:ascii="Times New Roman" w:hAnsi="Times New Roman" w:cs="Times New Roman"/>
-              <w:sz w:val="23"/>
-            </w:rPr>
-            <w:tab/>
-          </w:r>
-          <w:r>
-            <w:rPr>
-              <w:rFonts w:ascii="Times New Roman" w:hAnsi="Times New Roman" w:cs="Times New Roman"/>
-              <w:sz w:val="23"/>
-            </w:rPr>
-            <w:t>4</w:t>
-          </w:r>
-        </w:p>
-        <w:p>
-          <w:pPr>
-            <w:pStyle w:val="TOC2"/>
-            <w:tabs>
-              <w:tab w:val="right" w:leader="dot" w:pos="9070"/>
-            </w:tabs>
-            <w:ind w:left="360"/>
-            <w:spacing w:before="24" w:after="24" w:line="240" w:lineRule="auto"/>
-          </w:pPr>
-          <w:r>
-            <w:rPr>
-              <w:rFonts w:ascii="Times New Roman" w:hAnsi="Times New Roman" w:cs="Times New Roman"/>
-              <w:sz w:val="23"/>
-            </w:rPr>
-            <w:t>1.5. Đóng góp chính của đề tài</w:t>
-          </w:r>
-          <w:r>
-            <w:rPr>
-              <w:rFonts w:ascii="Times New Roman" w:hAnsi="Times New Roman" w:cs="Times New Roman"/>
-              <w:sz w:val="23"/>
-            </w:rPr>
-            <w:tab/>
-          </w:r>
-          <w:r>
-            <w:rPr>
-              <w:rFonts w:ascii="Times New Roman" w:hAnsi="Times New Roman" w:cs="Times New Roman"/>
-              <w:sz w:val="23"/>
-            </w:rPr>
-            <w:t>4</w:t>
-          </w:r>
-        </w:p>
-        <w:p>
-          <w:pPr>
-            <w:pStyle w:val="TOC2"/>
-            <w:tabs>
-              <w:tab w:val="right" w:leader="dot" w:pos="9070"/>
-            </w:tabs>
-            <w:ind w:left="360"/>
-            <w:spacing w:before="24" w:after="24" w:line="240" w:lineRule="auto"/>
-          </w:pPr>
-          <w:r>
-            <w:rPr>
-              <w:rFonts w:ascii="Times New Roman" w:hAnsi="Times New Roman" w:cs="Times New Roman"/>
-              <w:sz w:val="23"/>
-            </w:rPr>
-            <w:t>1.6. Bố cục của báo cáo đồ án</w:t>
-          </w:r>
-          <w:r>
-            <w:rPr>
-              <w:rFonts w:ascii="Times New Roman" w:hAnsi="Times New Roman" w:cs="Times New Roman"/>
-              <w:sz w:val="23"/>
-            </w:rPr>
-            <w:tab/>
-          </w:r>
-          <w:r>
-            <w:rPr>
-              <w:rFonts w:ascii="Times New Roman" w:hAnsi="Times New Roman" w:cs="Times New Roman"/>
-              <w:sz w:val="23"/>
-            </w:rPr>
-            <w:t>5</w:t>
-          </w:r>
-        </w:p>
-        <w:p>
-          <w:pPr>
-            <w:pStyle w:val="TOC1"/>
-            <w:tabs>
-              <w:tab w:val="right" w:leader="dot" w:pos="9070"/>
-            </w:tabs>
-            <w:ind w:left="0"/>
-            <w:spacing w:before="24" w:after="24" w:line="240" w:lineRule="auto"/>
-          </w:pPr>
-          <w:r>
-            <w:rPr>
-              <w:rFonts w:ascii="Times New Roman" w:hAnsi="Times New Roman" w:cs="Times New Roman"/>
-              <w:b/>
-              <w:sz w:val="24"/>
-            </w:rPr>
-            <w:t>CHƯƠNG 2: CƠ SỞ LÝ THUYẾT VÀ CÁC CÔNG TRÌNH LIÊN QUAN</w:t>
-          </w:r>
-          <w:r>
-            <w:rPr>
-              <w:rFonts w:ascii="Times New Roman" w:hAnsi="Times New Roman" w:cs="Times New Roman"/>
-              <w:sz w:val="24"/>
-            </w:rPr>
-            <w:tab/>
-          </w:r>
-          <w:r>
-            <w:rPr>
-              <w:rFonts w:ascii="Times New Roman" w:hAnsi="Times New Roman" w:cs="Times New Roman"/>
-              <w:b/>
-              <w:sz w:val="24"/>
-            </w:rPr>
-            <w:t>6</w:t>
-          </w:r>
-        </w:p>
-        <w:p>
-          <w:pPr>
-            <w:pStyle w:val="TOC2"/>
-            <w:tabs>
-              <w:tab w:val="right" w:leader="dot" w:pos="9070"/>
-            </w:tabs>
-            <w:ind w:left="360"/>
-            <w:spacing w:before="24" w:after="24" w:line="240" w:lineRule="auto"/>
-          </w:pPr>
-          <w:r>
-            <w:rPr>
-              <w:rFonts w:ascii="Times New Roman" w:hAnsi="Times New Roman" w:cs="Times New Roman"/>
-              <w:sz w:val="23"/>
-            </w:rPr>
-            <w:t>2.1. Hệ thống kiểm chứng thông tin (Fact Verification) và Bài toán FEVER</w:t>
-          </w:r>
-          <w:r>
-            <w:rPr>
-              <w:rFonts w:ascii="Times New Roman" w:hAnsi="Times New Roman" w:cs="Times New Roman"/>
-              <w:sz w:val="23"/>
-            </w:rPr>
-            <w:tab/>
-          </w:r>
-          <w:r>
-            <w:rPr>
-              <w:rFonts w:ascii="Times New Roman" w:hAnsi="Times New Roman" w:cs="Times New Roman"/>
-              <w:sz w:val="23"/>
-            </w:rPr>
-            <w:t>6</w:t>
-          </w:r>
-        </w:p>
-        <w:p>
-          <w:pPr>
-            <w:pStyle w:val="TOC2"/>
-            <w:tabs>
-              <w:tab w:val="right" w:leader="dot" w:pos="9070"/>
-            </w:tabs>
-            <w:ind w:left="360"/>
-            <w:spacing w:before="24" w:after="24" w:line="240" w:lineRule="auto"/>
-          </w:pPr>
-          <w:r>
-            <w:rPr>
-              <w:rFonts w:ascii="Times New Roman" w:hAnsi="Times New Roman" w:cs="Times New Roman"/>
-              <w:sz w:val="23"/>
-            </w:rPr>
-            <w:t>2.2. Kiến trúc Retrieval-Augmented Generation (RAG)</w:t>
-          </w:r>
-          <w:r>
-            <w:rPr>
-              <w:rFonts w:ascii="Times New Roman" w:hAnsi="Times New Roman" w:cs="Times New Roman"/>
-              <w:sz w:val="23"/>
-            </w:rPr>
-            <w:tab/>
-          </w:r>
-          <w:r>
-            <w:rPr>
-              <w:rFonts w:ascii="Times New Roman" w:hAnsi="Times New Roman" w:cs="Times New Roman"/>
-              <w:sz w:val="23"/>
-            </w:rPr>
-            <w:t>7</w:t>
-          </w:r>
-        </w:p>
-        <w:p>
-          <w:pPr>
-            <w:pStyle w:val="TOC2"/>
-            <w:tabs>
-              <w:tab w:val="right" w:leader="dot" w:pos="9070"/>
-            </w:tabs>
-            <w:ind w:left="360"/>
-            <w:spacing w:before="24" w:after="24" w:line="240" w:lineRule="auto"/>
-          </w:pPr>
-          <w:r>
-            <w:rPr>
-              <w:rFonts w:ascii="Times New Roman" w:hAnsi="Times New Roman" w:cs="Times New Roman"/>
-              <w:sz w:val="23"/>
-            </w:rPr>
-            <w:t>2.3. Thuật toán truy xuất từ vựng BM25 (Best Matching 25)</w:t>
-          </w:r>
-          <w:r>
-            <w:rPr>
-              <w:rFonts w:ascii="Times New Roman" w:hAnsi="Times New Roman" w:cs="Times New Roman"/>
-              <w:sz w:val="23"/>
-            </w:rPr>
-            <w:tab/>
-          </w:r>
-          <w:r>
-            <w:rPr>
-              <w:rFonts w:ascii="Times New Roman" w:hAnsi="Times New Roman" w:cs="Times New Roman"/>
-              <w:sz w:val="23"/>
-            </w:rPr>
-            <w:t>8</w:t>
-          </w:r>
-        </w:p>
-        <w:p>
-          <w:pPr>
-            <w:pStyle w:val="TOC2"/>
-            <w:tabs>
-              <w:tab w:val="right" w:leader="dot" w:pos="9070"/>
-            </w:tabs>
-            <w:ind w:left="360"/>
-            <w:spacing w:before="24" w:after="24" w:line="240" w:lineRule="auto"/>
-          </w:pPr>
-          <w:r>
-            <w:rPr>
-              <w:rFonts w:ascii="Times New Roman" w:hAnsi="Times New Roman" w:cs="Times New Roman"/>
-              <w:sz w:val="23"/>
-            </w:rPr>
-            <w:t>2.4. Mô hình biểu diễn ngữ nghĩa đa ngôn ngữ BGE-M3</w:t>
-          </w:r>
-          <w:r>
-            <w:rPr>
-              <w:rFonts w:ascii="Times New Roman" w:hAnsi="Times New Roman" w:cs="Times New Roman"/>
-              <w:sz w:val="23"/>
-            </w:rPr>
-            <w:tab/>
-          </w:r>
-          <w:r>
-            <w:rPr>
-              <w:rFonts w:ascii="Times New Roman" w:hAnsi="Times New Roman" w:cs="Times New Roman"/>
-              <w:sz w:val="23"/>
-            </w:rPr>
-            <w:t>9</w:t>
-          </w:r>
-        </w:p>
-        <w:p>
-          <w:pPr>
-            <w:pStyle w:val="TOC2"/>
-            <w:tabs>
-              <w:tab w:val="right" w:leader="dot" w:pos="9070"/>
-            </w:tabs>
-            <w:ind w:left="360"/>
-            <w:spacing w:before="24" w:after="24" w:line="240" w:lineRule="auto"/>
-          </w:pPr>
-          <w:r>
-            <w:rPr>
-              <w:rFonts w:ascii="Times New Roman" w:hAnsi="Times New Roman" w:cs="Times New Roman"/>
-              <w:sz w:val="23"/>
-            </w:rPr>
-            <w:t>2.5. Dung hợp thứ hạng nghịch đảo (Reciprocal Rank Fusion - RRF)</w:t>
-          </w:r>
-          <w:r>
-            <w:rPr>
-              <w:rFonts w:ascii="Times New Roman" w:hAnsi="Times New Roman" w:cs="Times New Roman"/>
-              <w:sz w:val="23"/>
-            </w:rPr>
-            <w:tab/>
-          </w:r>
-          <w:r>
-            <w:rPr>
-              <w:rFonts w:ascii="Times New Roman" w:hAnsi="Times New Roman" w:cs="Times New Roman"/>
-              <w:sz w:val="23"/>
-            </w:rPr>
-            <w:t>10</w:t>
-          </w:r>
-        </w:p>
-        <w:p>
-          <w:pPr>
-            <w:pStyle w:val="TOC2"/>
-            <w:tabs>
-              <w:tab w:val="right" w:leader="dot" w:pos="9070"/>
-            </w:tabs>
-            <w:ind w:left="360"/>
-            <w:spacing w:before="24" w:after="24" w:line="240" w:lineRule="auto"/>
-          </w:pPr>
-          <w:r>
-            <w:rPr>
-              <w:rFonts w:ascii="Times New Roman" w:hAnsi="Times New Roman" w:cs="Times New Roman"/>
-              <w:sz w:val="23"/>
-            </w:rPr>
-            <w:t>2.6. Tái xếp hạng bằng Cross-Encoder Reranker</w:t>
-          </w:r>
-          <w:r>
-            <w:rPr>
-              <w:rFonts w:ascii="Times New Roman" w:hAnsi="Times New Roman" w:cs="Times New Roman"/>
-              <w:sz w:val="23"/>
-            </w:rPr>
-            <w:tab/>
-          </w:r>
-          <w:r>
-            <w:rPr>
-              <w:rFonts w:ascii="Times New Roman" w:hAnsi="Times New Roman" w:cs="Times New Roman"/>
-              <w:sz w:val="23"/>
-            </w:rPr>
-            <w:t>11</w:t>
-          </w:r>
-        </w:p>
-        <w:p>
-          <w:pPr>
-            <w:pStyle w:val="TOC2"/>
-            <w:tabs>
-              <w:tab w:val="right" w:leader="dot" w:pos="9070"/>
-            </w:tabs>
-            <w:ind w:left="360"/>
-            <w:spacing w:before="24" w:after="24" w:line="240" w:lineRule="auto"/>
-          </w:pPr>
-          <w:r>
-            <w:rPr>
-              <w:rFonts w:ascii="Times New Roman" w:hAnsi="Times New Roman" w:cs="Times New Roman"/>
-              <w:sz w:val="23"/>
-            </w:rPr>
-            <w:t>2.7. Mô hình Qwen2.5-7B-Instruct và Kỹ thuật lượng tử hóa 4-bit NF4</w:t>
-          </w:r>
-          <w:r>
-            <w:rPr>
-              <w:rFonts w:ascii="Times New Roman" w:hAnsi="Times New Roman" w:cs="Times New Roman"/>
-              <w:sz w:val="23"/>
-            </w:rPr>
-            <w:tab/>
-          </w:r>
-          <w:r>
-            <w:rPr>
-              <w:rFonts w:ascii="Times New Roman" w:hAnsi="Times New Roman" w:cs="Times New Roman"/>
-              <w:sz w:val="23"/>
-            </w:rPr>
-            <w:t>12</w:t>
-          </w:r>
-        </w:p>
-        <w:p>
-          <w:pPr>
-            <w:pStyle w:val="TOC2"/>
-            <w:tabs>
-              <w:tab w:val="right" w:leader="dot" w:pos="9070"/>
-            </w:tabs>
-            <w:ind w:left="360"/>
-            <w:spacing w:before="24" w:after="24" w:line="240" w:lineRule="auto"/>
-          </w:pPr>
-          <w:r>
-            <w:rPr>
-              <w:rFonts w:ascii="Times New Roman" w:hAnsi="Times New Roman" w:cs="Times New Roman"/>
-              <w:sz w:val="23"/>
-            </w:rPr>
-            <w:t>2.8. Thách thức đặc thù trong Xử lý ngôn ngữ tự nhiên tiếng Việt</w:t>
-          </w:r>
-          <w:r>
-            <w:rPr>
-              <w:rFonts w:ascii="Times New Roman" w:hAnsi="Times New Roman" w:cs="Times New Roman"/>
-              <w:sz w:val="23"/>
-            </w:rPr>
-            <w:tab/>
-          </w:r>
-          <w:r>
-            <w:rPr>
-              <w:rFonts w:ascii="Times New Roman" w:hAnsi="Times New Roman" w:cs="Times New Roman"/>
-              <w:sz w:val="23"/>
-            </w:rPr>
-            <w:t>13</w:t>
-          </w:r>
-        </w:p>
-        <w:p>
-          <w:pPr>
-            <w:pStyle w:val="TOC3"/>
-            <w:tabs>
-              <w:tab w:val="right" w:leader="dot" w:pos="9070"/>
-            </w:tabs>
-            <w:ind w:left="720"/>
-            <w:spacing w:before="24" w:after="24" w:line="240" w:lineRule="auto"/>
-          </w:pPr>
-          <w:r>
-            <w:rPr>
-              <w:rFonts w:ascii="Times New Roman" w:hAnsi="Times New Roman" w:cs="Times New Roman"/>
-              <w:sz w:val="23"/>
-            </w:rPr>
-            <w:t>2.8.1. Phân định ranh giới từ (Word Segmentation)</w:t>
-          </w:r>
-          <w:r>
-            <w:rPr>
-              <w:rFonts w:ascii="Times New Roman" w:hAnsi="Times New Roman" w:cs="Times New Roman"/>
-              <w:sz w:val="23"/>
-            </w:rPr>
-            <w:tab/>
-          </w:r>
-          <w:r>
-            <w:rPr>
-              <w:rFonts w:ascii="Times New Roman" w:hAnsi="Times New Roman" w:cs="Times New Roman"/>
-              <w:sz w:val="23"/>
-            </w:rPr>
-            <w:t>13</w:t>
-          </w:r>
-        </w:p>
-        <w:p>
-          <w:pPr>
-            <w:pStyle w:val="TOC3"/>
-            <w:tabs>
-              <w:tab w:val="right" w:leader="dot" w:pos="9070"/>
-            </w:tabs>
-            <w:ind w:left="720"/>
-            <w:spacing w:before="24" w:after="24" w:line="240" w:lineRule="auto"/>
-          </w:pPr>
-          <w:r>
-            <w:rPr>
-              <w:rFonts w:ascii="Times New Roman" w:hAnsi="Times New Roman" w:cs="Times New Roman"/>
-              <w:sz w:val="23"/>
-            </w:rPr>
-            <w:t>2.8.2. Dấu thanh điệu và Chuẩn hóa Unicode</w:t>
-          </w:r>
-          <w:r>
-            <w:rPr>
-              <w:rFonts w:ascii="Times New Roman" w:hAnsi="Times New Roman" w:cs="Times New Roman"/>
-              <w:sz w:val="23"/>
-            </w:rPr>
-            <w:tab/>
-          </w:r>
-          <w:r>
-            <w:rPr>
-              <w:rFonts w:ascii="Times New Roman" w:hAnsi="Times New Roman" w:cs="Times New Roman"/>
-              <w:sz w:val="23"/>
-            </w:rPr>
-            <w:t>13</w:t>
-          </w:r>
-        </w:p>
-        <w:p>
-          <w:pPr>
-            <w:pStyle w:val="TOC3"/>
-            <w:tabs>
-              <w:tab w:val="right" w:leader="dot" w:pos="9070"/>
-            </w:tabs>
-            <w:ind w:left="720"/>
-            <w:spacing w:before="24" w:after="24" w:line="240" w:lineRule="auto"/>
-          </w:pPr>
-          <w:r>
-            <w:rPr>
-              <w:rFonts w:ascii="Times New Roman" w:hAnsi="Times New Roman" w:cs="Times New Roman"/>
-              <w:sz w:val="23"/>
-            </w:rPr>
-            <w:t>2.8.3. Khan hiếm tài nguyên ngữ liệu kiểm chứng</w:t>
-          </w:r>
-          <w:r>
-            <w:rPr>
-              <w:rFonts w:ascii="Times New Roman" w:hAnsi="Times New Roman" w:cs="Times New Roman"/>
-              <w:sz w:val="23"/>
-            </w:rPr>
-            <w:tab/>
-          </w:r>
-          <w:r>
-            <w:rPr>
-              <w:rFonts w:ascii="Times New Roman" w:hAnsi="Times New Roman" w:cs="Times New Roman"/>
-              <w:sz w:val="23"/>
-            </w:rPr>
-            <w:t>14</w:t>
-          </w:r>
-        </w:p>
-        <w:p>
-          <w:pPr>
-            <w:pStyle w:val="TOC2"/>
-            <w:tabs>
-              <w:tab w:val="right" w:leader="dot" w:pos="9070"/>
-            </w:tabs>
-            <w:ind w:left="360"/>
-            <w:spacing w:before="24" w:after="24" w:line="240" w:lineRule="auto"/>
-          </w:pPr>
-          <w:r>
-            <w:rPr>
-              <w:rFonts w:ascii="Times New Roman" w:hAnsi="Times New Roman" w:cs="Times New Roman"/>
-              <w:sz w:val="23"/>
-            </w:rPr>
-            <w:t>2.9. Khảo sát toàn diện các Baseline và Công trình liên quan</w:t>
-          </w:r>
-          <w:r>
-            <w:rPr>
-              <w:rFonts w:ascii="Times New Roman" w:hAnsi="Times New Roman" w:cs="Times New Roman"/>
-              <w:sz w:val="23"/>
-            </w:rPr>
-            <w:tab/>
-          </w:r>
-          <w:r>
-            <w:rPr>
-              <w:rFonts w:ascii="Times New Roman" w:hAnsi="Times New Roman" w:cs="Times New Roman"/>
-              <w:sz w:val="23"/>
-            </w:rPr>
-            <w:t>14</w:t>
-          </w:r>
-        </w:p>
-        <w:p>
-          <w:pPr>
-            <w:pStyle w:val="TOC3"/>
-            <w:tabs>
-              <w:tab w:val="right" w:leader="dot" w:pos="9070"/>
-            </w:tabs>
-            <w:ind w:left="720"/>
-            <w:spacing w:before="24" w:after="24" w:line="240" w:lineRule="auto"/>
-          </w:pPr>
-          <w:r>
-            <w:rPr>
-              <w:rFonts w:ascii="Times New Roman" w:hAnsi="Times New Roman" w:cs="Times New Roman"/>
-              <w:sz w:val="23"/>
-            </w:rPr>
-            <w:t>2.9.1. Baseline 1: BM25 + InfoXLM-Large (ViWikiFC gốc)</w:t>
-          </w:r>
-          <w:r>
-            <w:rPr>
-              <w:rFonts w:ascii="Times New Roman" w:hAnsi="Times New Roman" w:cs="Times New Roman"/>
-              <w:sz w:val="23"/>
-            </w:rPr>
-            <w:tab/>
-          </w:r>
-          <w:r>
-            <w:rPr>
-              <w:rFonts w:ascii="Times New Roman" w:hAnsi="Times New Roman" w:cs="Times New Roman"/>
-              <w:sz w:val="23"/>
-            </w:rPr>
-            <w:t>14</w:t>
-          </w:r>
-        </w:p>
-        <w:p>
-          <w:pPr>
-            <w:pStyle w:val="TOC3"/>
-            <w:tabs>
-              <w:tab w:val="right" w:leader="dot" w:pos="9070"/>
-            </w:tabs>
-            <w:ind w:left="720"/>
-            <w:spacing w:before="24" w:after="24" w:line="240" w:lineRule="auto"/>
-          </w:pPr>
-          <w:r>
-            <w:rPr>
-              <w:rFonts w:ascii="Times New Roman" w:hAnsi="Times New Roman" w:cs="Times New Roman"/>
-              <w:sz w:val="23"/>
-            </w:rPr>
-            <w:t>2.9.2. Baseline 2: SemViQA / SemViQA Faster (SOTA ViWikiFC)</w:t>
-          </w:r>
-          <w:r>
-            <w:rPr>
-              <w:rFonts w:ascii="Times New Roman" w:hAnsi="Times New Roman" w:cs="Times New Roman"/>
-              <w:sz w:val="23"/>
-            </w:rPr>
-            <w:tab/>
-          </w:r>
-          <w:r>
-            <w:rPr>
-              <w:rFonts w:ascii="Times New Roman" w:hAnsi="Times New Roman" w:cs="Times New Roman"/>
-              <w:sz w:val="23"/>
-            </w:rPr>
-            <w:t>15</w:t>
-          </w:r>
-        </w:p>
-        <w:p>
-          <w:pPr>
-            <w:pStyle w:val="TOC3"/>
-            <w:tabs>
-              <w:tab w:val="right" w:leader="dot" w:pos="9070"/>
-            </w:tabs>
-            <w:ind w:left="720"/>
-            <w:spacing w:before="24" w:after="24" w:line="240" w:lineRule="auto"/>
-          </w:pPr>
-          <w:r>
-            <w:rPr>
-              <w:rFonts w:ascii="Times New Roman" w:hAnsi="Times New Roman" w:cs="Times New Roman"/>
-              <w:sz w:val="23"/>
-            </w:rPr>
-            <w:t>2.9.3. Baseline 3: ViFactCheck Baseline (AAAI 2025)</w:t>
-          </w:r>
-          <w:r>
-            <w:rPr>
-              <w:rFonts w:ascii="Times New Roman" w:hAnsi="Times New Roman" w:cs="Times New Roman"/>
-              <w:sz w:val="23"/>
-            </w:rPr>
-            <w:tab/>
-          </w:r>
-          <w:r>
-            <w:rPr>
-              <w:rFonts w:ascii="Times New Roman" w:hAnsi="Times New Roman" w:cs="Times New Roman"/>
-              <w:sz w:val="23"/>
-            </w:rPr>
-            <w:t>15</w:t>
-          </w:r>
-        </w:p>
-        <w:p>
-          <w:pPr>
-            <w:pStyle w:val="TOC3"/>
-            <w:tabs>
-              <w:tab w:val="right" w:leader="dot" w:pos="9070"/>
-            </w:tabs>
-            <w:ind w:left="720"/>
-            <w:spacing w:before="24" w:after="24" w:line="240" w:lineRule="auto"/>
-          </w:pPr>
-          <w:r>
-            <w:rPr>
-              <w:rFonts w:ascii="Times New Roman" w:hAnsi="Times New Roman" w:cs="Times New Roman"/>
-              <w:sz w:val="23"/>
-            </w:rPr>
-            <w:t>2.9.4. Baseline 4: ReINTEL SOTA Baseline (VLSP 2020)</w:t>
-          </w:r>
-          <w:r>
-            <w:rPr>
-              <w:rFonts w:ascii="Times New Roman" w:hAnsi="Times New Roman" w:cs="Times New Roman"/>
-              <w:sz w:val="23"/>
-            </w:rPr>
-            <w:tab/>
-          </w:r>
-          <w:r>
-            <w:rPr>
-              <w:rFonts w:ascii="Times New Roman" w:hAnsi="Times New Roman" w:cs="Times New Roman"/>
-              <w:sz w:val="23"/>
-            </w:rPr>
-            <w:t>16</w:t>
-          </w:r>
-        </w:p>
-        <w:p>
-          <w:pPr>
-            <w:pStyle w:val="TOC3"/>
-            <w:tabs>
-              <w:tab w:val="right" w:leader="dot" w:pos="9070"/>
-            </w:tabs>
-            <w:ind w:left="720"/>
-            <w:spacing w:before="24" w:after="24" w:line="240" w:lineRule="auto"/>
-          </w:pPr>
-          <w:r>
-            <w:rPr>
-              <w:rFonts w:ascii="Times New Roman" w:hAnsi="Times New Roman" w:cs="Times New Roman"/>
-              <w:sz w:val="23"/>
-            </w:rPr>
-            <w:t>2.9.5. Baseline 5: Program-FC (ACL 2023)</w:t>
-          </w:r>
-          <w:r>
-            <w:rPr>
-              <w:rFonts w:ascii="Times New Roman" w:hAnsi="Times New Roman" w:cs="Times New Roman"/>
-              <w:sz w:val="23"/>
-            </w:rPr>
-            <w:tab/>
-          </w:r>
-          <w:r>
-            <w:rPr>
-              <w:rFonts w:ascii="Times New Roman" w:hAnsi="Times New Roman" w:cs="Times New Roman"/>
-              <w:sz w:val="23"/>
-            </w:rPr>
-            <w:t>16</w:t>
-          </w:r>
-        </w:p>
-        <w:p>
-          <w:pPr>
-            <w:pStyle w:val="TOC3"/>
-            <w:tabs>
-              <w:tab w:val="right" w:leader="dot" w:pos="9070"/>
-            </w:tabs>
-            <w:ind w:left="720"/>
-            <w:spacing w:before="24" w:after="24" w:line="240" w:lineRule="auto"/>
-          </w:pPr>
-          <w:r>
-            <w:rPr>
-              <w:rFonts w:ascii="Times New Roman" w:hAnsi="Times New Roman" w:cs="Times New Roman"/>
-              <w:sz w:val="23"/>
-            </w:rPr>
-            <w:t>2.9.6. Baseline 6: Self-Checker / RAG-FactLLM (2024)</w:t>
-          </w:r>
-          <w:r>
-            <w:rPr>
-              <w:rFonts w:ascii="Times New Roman" w:hAnsi="Times New Roman" w:cs="Times New Roman"/>
-              <w:sz w:val="23"/>
-            </w:rPr>
-            <w:tab/>
-          </w:r>
-          <w:r>
-            <w:rPr>
-              <w:rFonts w:ascii="Times New Roman" w:hAnsi="Times New Roman" w:cs="Times New Roman"/>
-              <w:sz w:val="23"/>
-            </w:rPr>
-            <w:t>17</w:t>
-          </w:r>
-        </w:p>
-        <w:p>
-          <w:pPr>
-            <w:pStyle w:val="TOC3"/>
-            <w:tabs>
-              <w:tab w:val="right" w:leader="dot" w:pos="9070"/>
-            </w:tabs>
-            <w:ind w:left="720"/>
-            <w:spacing w:before="24" w:after="24" w:line="240" w:lineRule="auto"/>
-          </w:pPr>
-          <w:r>
-            <w:rPr>
-              <w:rFonts w:ascii="Times New Roman" w:hAnsi="Times New Roman" w:cs="Times New Roman"/>
-              <w:sz w:val="23"/>
-            </w:rPr>
-            <w:t>2.9.7. Baseline 7: LLM Direct Prompting (Ablation)</w:t>
-          </w:r>
-          <w:r>
-            <w:rPr>
-              <w:rFonts w:ascii="Times New Roman" w:hAnsi="Times New Roman" w:cs="Times New Roman"/>
-              <w:sz w:val="23"/>
-            </w:rPr>
-            <w:tab/>
-          </w:r>
-          <w:r>
-            <w:rPr>
-              <w:rFonts w:ascii="Times New Roman" w:hAnsi="Times New Roman" w:cs="Times New Roman"/>
-              <w:sz w:val="23"/>
-            </w:rPr>
-            <w:t>17</w:t>
-          </w:r>
-        </w:p>
-        <w:p>
-          <w:pPr>
-            <w:pStyle w:val="TOC1"/>
-            <w:tabs>
-              <w:tab w:val="right" w:leader="dot" w:pos="9070"/>
-            </w:tabs>
-            <w:ind w:left="0"/>
-            <w:spacing w:before="24" w:after="24" w:line="240" w:lineRule="auto"/>
-          </w:pPr>
-          <w:r>
-            <w:rPr>
-              <w:rFonts w:ascii="Times New Roman" w:hAnsi="Times New Roman" w:cs="Times New Roman"/>
-              <w:b/>
-              <w:sz w:val="24"/>
-            </w:rPr>
-            <w:t>CHƯƠNG 3: DỮ LIỆU THỰC NGHIỆM VÀ QUY TRÌNH TIỀN XỬ LÝ</w:t>
-          </w:r>
-          <w:r>
-            <w:rPr>
-              <w:rFonts w:ascii="Times New Roman" w:hAnsi="Times New Roman" w:cs="Times New Roman"/>
-              <w:sz w:val="24"/>
-            </w:rPr>
-            <w:tab/>
-          </w:r>
-          <w:r>
-            <w:rPr>
-              <w:rFonts w:ascii="Times New Roman" w:hAnsi="Times New Roman" w:cs="Times New Roman"/>
-              <w:b/>
-              <w:sz w:val="24"/>
-            </w:rPr>
-            <w:t>18</w:t>
-          </w:r>
-        </w:p>
-        <w:p>
-          <w:pPr>
-            <w:pStyle w:val="TOC2"/>
-            <w:tabs>
-              <w:tab w:val="right" w:leader="dot" w:pos="9070"/>
-            </w:tabs>
-            <w:ind w:left="360"/>
-            <w:spacing w:before="24" w:after="24" w:line="240" w:lineRule="auto"/>
-          </w:pPr>
-          <w:r>
-            <w:rPr>
-              <w:rFonts w:ascii="Times New Roman" w:hAnsi="Times New Roman" w:cs="Times New Roman"/>
-              <w:sz w:val="23"/>
-            </w:rPr>
-            <w:t>3.1. Khảo sát các bộ dữ liệu Fact-Checking và Fake News đã công bố</w:t>
-          </w:r>
-          <w:r>
-            <w:rPr>
-              <w:rFonts w:ascii="Times New Roman" w:hAnsi="Times New Roman" w:cs="Times New Roman"/>
-              <w:sz w:val="23"/>
-            </w:rPr>
-            <w:tab/>
-          </w:r>
-          <w:r>
-            <w:rPr>
-              <w:rFonts w:ascii="Times New Roman" w:hAnsi="Times New Roman" w:cs="Times New Roman"/>
-              <w:sz w:val="23"/>
-            </w:rPr>
-            <w:t>18</w:t>
-          </w:r>
-        </w:p>
-        <w:p>
-          <w:pPr>
-            <w:pStyle w:val="TOC2"/>
-            <w:tabs>
-              <w:tab w:val="right" w:leader="dot" w:pos="9070"/>
-            </w:tabs>
-            <w:ind w:left="360"/>
-            <w:spacing w:before="24" w:after="24" w:line="240" w:lineRule="auto"/>
-          </w:pPr>
-          <w:r>
-            <w:rPr>
-              <w:rFonts w:ascii="Times New Roman" w:hAnsi="Times New Roman" w:cs="Times New Roman"/>
-              <w:sz w:val="23"/>
-            </w:rPr>
-            <w:t>3.2. Tập dữ liệu ViWikiFC (Bách khoa toàn thư Wikipedia)</w:t>
-          </w:r>
-          <w:r>
-            <w:rPr>
-              <w:rFonts w:ascii="Times New Roman" w:hAnsi="Times New Roman" w:cs="Times New Roman"/>
-              <w:sz w:val="23"/>
-            </w:rPr>
-            <w:tab/>
-          </w:r>
-          <w:r>
-            <w:rPr>
-              <w:rFonts w:ascii="Times New Roman" w:hAnsi="Times New Roman" w:cs="Times New Roman"/>
-              <w:sz w:val="23"/>
-            </w:rPr>
-            <w:t>19</w:t>
-          </w:r>
-        </w:p>
-        <w:p>
-          <w:pPr>
-            <w:pStyle w:val="TOC2"/>
-            <w:tabs>
-              <w:tab w:val="right" w:leader="dot" w:pos="9070"/>
-            </w:tabs>
-            <w:ind w:left="360"/>
-            <w:spacing w:before="24" w:after="24" w:line="240" w:lineRule="auto"/>
-          </w:pPr>
-          <w:r>
-            <w:rPr>
-              <w:rFonts w:ascii="Times New Roman" w:hAnsi="Times New Roman" w:cs="Times New Roman"/>
-              <w:sz w:val="23"/>
-            </w:rPr>
-            <w:t>3.3. Tập dữ liệu ViFactCheck (Báo chí chính thống đa lĩnh vực - AAAI 2025)</w:t>
-          </w:r>
-          <w:r>
-            <w:rPr>
-              <w:rFonts w:ascii="Times New Roman" w:hAnsi="Times New Roman" w:cs="Times New Roman"/>
-              <w:sz w:val="23"/>
-            </w:rPr>
-            <w:tab/>
-          </w:r>
-          <w:r>
-            <w:rPr>
-              <w:rFonts w:ascii="Times New Roman" w:hAnsi="Times New Roman" w:cs="Times New Roman"/>
-              <w:sz w:val="23"/>
-            </w:rPr>
-            <w:t>20</w:t>
-          </w:r>
-        </w:p>
-        <w:p>
-          <w:pPr>
-            <w:pStyle w:val="TOC2"/>
-            <w:tabs>
-              <w:tab w:val="right" w:leader="dot" w:pos="9070"/>
-            </w:tabs>
-            <w:ind w:left="360"/>
-            <w:spacing w:before="24" w:after="24" w:line="240" w:lineRule="auto"/>
-          </w:pPr>
-          <w:r>
-            <w:rPr>
-              <w:rFonts w:ascii="Times New Roman" w:hAnsi="Times New Roman" w:cs="Times New Roman"/>
-              <w:sz w:val="23"/>
-            </w:rPr>
-            <w:t>3.4. Quy trình Chuẩn hóa và Hợp nhất dữ liệu (Data Harmonization)</w:t>
-          </w:r>
-          <w:r>
-            <w:rPr>
-              <w:rFonts w:ascii="Times New Roman" w:hAnsi="Times New Roman" w:cs="Times New Roman"/>
-              <w:sz w:val="23"/>
-            </w:rPr>
-            <w:tab/>
-          </w:r>
-          <w:r>
-            <w:rPr>
-              <w:rFonts w:ascii="Times New Roman" w:hAnsi="Times New Roman" w:cs="Times New Roman"/>
-              <w:sz w:val="23"/>
-            </w:rPr>
-            <w:t>21</w:t>
-          </w:r>
-        </w:p>
-        <w:p>
-          <w:pPr>
-            <w:pStyle w:val="TOC2"/>
-            <w:tabs>
-              <w:tab w:val="right" w:leader="dot" w:pos="9070"/>
-            </w:tabs>
-            <w:ind w:left="360"/>
-            <w:spacing w:before="24" w:after="24" w:line="240" w:lineRule="auto"/>
-          </w:pPr>
-          <w:r>
-            <w:rPr>
-              <w:rFonts w:ascii="Times New Roman" w:hAnsi="Times New Roman" w:cs="Times New Roman"/>
-              <w:sz w:val="23"/>
-            </w:rPr>
-            <w:t>3.5. Xây dựng Kho ngữ liệu tri thức thống nhất (Unified Evidence Corpus)</w:t>
-          </w:r>
-          <w:r>
-            <w:rPr>
-              <w:rFonts w:ascii="Times New Roman" w:hAnsi="Times New Roman" w:cs="Times New Roman"/>
-              <w:sz w:val="23"/>
-            </w:rPr>
-            <w:tab/>
-          </w:r>
-          <w:r>
-            <w:rPr>
-              <w:rFonts w:ascii="Times New Roman" w:hAnsi="Times New Roman" w:cs="Times New Roman"/>
-              <w:sz w:val="23"/>
-            </w:rPr>
-            <w:t>22</w:t>
-          </w:r>
-        </w:p>
-        <w:p>
-          <w:pPr>
-            <w:pStyle w:val="TOC1"/>
-            <w:tabs>
-              <w:tab w:val="right" w:leader="dot" w:pos="9070"/>
-            </w:tabs>
-            <w:ind w:left="0"/>
-            <w:spacing w:before="24" w:after="24" w:line="240" w:lineRule="auto"/>
-          </w:pPr>
-          <w:r>
-            <w:rPr>
-              <w:rFonts w:ascii="Times New Roman" w:hAnsi="Times New Roman" w:cs="Times New Roman"/>
-              <w:b/>
-              <w:sz w:val="24"/>
-            </w:rPr>
-            <w:t>CHƯƠNG 4: PHƯƠNG PHÁP ĐỀ XUẤT: HỆ THỐNG SER + TVC + RAG</w:t>
-          </w:r>
-          <w:r>
-            <w:rPr>
-              <w:rFonts w:ascii="Times New Roman" w:hAnsi="Times New Roman" w:cs="Times New Roman"/>
-              <w:sz w:val="24"/>
-            </w:rPr>
-            <w:tab/>
-          </w:r>
-          <w:r>
-            <w:rPr>
-              <w:rFonts w:ascii="Times New Roman" w:hAnsi="Times New Roman" w:cs="Times New Roman"/>
-              <w:b/>
-              <w:sz w:val="24"/>
-            </w:rPr>
-            <w:t>23</w:t>
-          </w:r>
-        </w:p>
-        <w:p>
-          <w:pPr>
-            <w:pStyle w:val="TOC2"/>
-            <w:tabs>
-              <w:tab w:val="right" w:leader="dot" w:pos="9070"/>
-            </w:tabs>
-            <w:ind w:left="360"/>
-            <w:spacing w:before="24" w:after="24" w:line="240" w:lineRule="auto"/>
-          </w:pPr>
-          <w:r>
-            <w:rPr>
-              <w:rFonts w:ascii="Times New Roman" w:hAnsi="Times New Roman" w:cs="Times New Roman"/>
-              <w:sz w:val="23"/>
-            </w:rPr>
-            <w:t>4.1. Kiến trúc tổng thể hệ thống</w:t>
-          </w:r>
-          <w:r>
-            <w:rPr>
-              <w:rFonts w:ascii="Times New Roman" w:hAnsi="Times New Roman" w:cs="Times New Roman"/>
-              <w:sz w:val="23"/>
-            </w:rPr>
-            <w:tab/>
-          </w:r>
-          <w:r>
-            <w:rPr>
-              <w:rFonts w:ascii="Times New Roman" w:hAnsi="Times New Roman" w:cs="Times New Roman"/>
-              <w:sz w:val="23"/>
-            </w:rPr>
-            <w:t>23</w:t>
-          </w:r>
-        </w:p>
-        <w:p>
-          <w:pPr>
-            <w:pStyle w:val="TOC2"/>
-            <w:tabs>
-              <w:tab w:val="right" w:leader="dot" w:pos="9070"/>
-            </w:tabs>
-            <w:ind w:left="360"/>
-            <w:spacing w:before="24" w:after="24" w:line="240" w:lineRule="auto"/>
-          </w:pPr>
-          <w:r>
-            <w:rPr>
-              <w:rFonts w:ascii="Times New Roman" w:hAnsi="Times New Roman" w:cs="Times New Roman"/>
-              <w:sz w:val="23"/>
-            </w:rPr>
-            <w:t>4.2. Mô-đun Truy xuất bằng chứng ngữ nghĩa (Semantic Evidence Retrieval - SER)</w:t>
-          </w:r>
-          <w:r>
-            <w:rPr>
-              <w:rFonts w:ascii="Times New Roman" w:hAnsi="Times New Roman" w:cs="Times New Roman"/>
-              <w:sz w:val="23"/>
-            </w:rPr>
-            <w:tab/>
-          </w:r>
-          <w:r>
-            <w:rPr>
-              <w:rFonts w:ascii="Times New Roman" w:hAnsi="Times New Roman" w:cs="Times New Roman"/>
-              <w:sz w:val="23"/>
-            </w:rPr>
-            <w:t>24</w:t>
-          </w:r>
-        </w:p>
-        <w:p>
-          <w:pPr>
-            <w:pStyle w:val="TOC3"/>
-            <w:tabs>
-              <w:tab w:val="right" w:leader="dot" w:pos="9070"/>
-            </w:tabs>
-            <w:ind w:left="720"/>
-            <w:spacing w:before="24" w:after="24" w:line="240" w:lineRule="auto"/>
-          </w:pPr>
-          <w:r>
-            <w:rPr>
-              <w:rFonts w:ascii="Times New Roman" w:hAnsi="Times New Roman" w:cs="Times New Roman"/>
-              <w:sz w:val="23"/>
-            </w:rPr>
-            <w:t>4.2.1. Sparse Retrieval với BM25Okapi</w:t>
-          </w:r>
-          <w:r>
-            <w:rPr>
-              <w:rFonts w:ascii="Times New Roman" w:hAnsi="Times New Roman" w:cs="Times New Roman"/>
-              <w:sz w:val="23"/>
-            </w:rPr>
-            <w:tab/>
-          </w:r>
-          <w:r>
-            <w:rPr>
-              <w:rFonts w:ascii="Times New Roman" w:hAnsi="Times New Roman" w:cs="Times New Roman"/>
-              <w:sz w:val="23"/>
-            </w:rPr>
-            <w:t>24</w:t>
-          </w:r>
-        </w:p>
-        <w:p>
-          <w:pPr>
-            <w:pStyle w:val="TOC3"/>
-            <w:tabs>
-              <w:tab w:val="right" w:leader="dot" w:pos="9070"/>
-            </w:tabs>
-            <w:ind w:left="720"/>
-            <w:spacing w:before="24" w:after="24" w:line="240" w:lineRule="auto"/>
-          </w:pPr>
-          <w:r>
-            <w:rPr>
-              <w:rFonts w:ascii="Times New Roman" w:hAnsi="Times New Roman" w:cs="Times New Roman"/>
-              <w:sz w:val="23"/>
-            </w:rPr>
-            <w:t>4.2.2. Dense Retrieval với BGE-M3 + FAISS</w:t>
-          </w:r>
-          <w:r>
-            <w:rPr>
-              <w:rFonts w:ascii="Times New Roman" w:hAnsi="Times New Roman" w:cs="Times New Roman"/>
-              <w:sz w:val="23"/>
-            </w:rPr>
-            <w:tab/>
-          </w:r>
-          <w:r>
-            <w:rPr>
-              <w:rFonts w:ascii="Times New Roman" w:hAnsi="Times New Roman" w:cs="Times New Roman"/>
-              <w:sz w:val="23"/>
-            </w:rPr>
-            <w:t>24</w:t>
-          </w:r>
-        </w:p>
-        <w:p>
-          <w:pPr>
-            <w:pStyle w:val="TOC3"/>
-            <w:tabs>
-              <w:tab w:val="right" w:leader="dot" w:pos="9070"/>
-            </w:tabs>
-            <w:ind w:left="720"/>
-            <w:spacing w:before="24" w:after="24" w:line="240" w:lineRule="auto"/>
-          </w:pPr>
-          <w:r>
-            <w:rPr>
-              <w:rFonts w:ascii="Times New Roman" w:hAnsi="Times New Roman" w:cs="Times New Roman"/>
-              <w:sz w:val="23"/>
-            </w:rPr>
-            <w:t>4.2.3. Dung hợp thứ hạng nghịch đảo RRF</w:t>
-          </w:r>
-          <w:r>
-            <w:rPr>
-              <w:rFonts w:ascii="Times New Roman" w:hAnsi="Times New Roman" w:cs="Times New Roman"/>
-              <w:sz w:val="23"/>
-            </w:rPr>
-            <w:tab/>
-          </w:r>
-          <w:r>
-            <w:rPr>
-              <w:rFonts w:ascii="Times New Roman" w:hAnsi="Times New Roman" w:cs="Times New Roman"/>
-              <w:sz w:val="23"/>
-            </w:rPr>
-            <w:t>25</w:t>
-          </w:r>
-        </w:p>
-        <w:p>
-          <w:pPr>
-            <w:pStyle w:val="TOC3"/>
-            <w:tabs>
-              <w:tab w:val="right" w:leader="dot" w:pos="9070"/>
-            </w:tabs>
-            <w:ind w:left="720"/>
-            <w:spacing w:before="24" w:after="24" w:line="240" w:lineRule="auto"/>
-          </w:pPr>
-          <w:r>
-            <w:rPr>
-              <w:rFonts w:ascii="Times New Roman" w:hAnsi="Times New Roman" w:cs="Times New Roman"/>
-              <w:sz w:val="23"/>
-            </w:rPr>
-            <w:t>4.2.4. Neural Cross-Encoder Reranking</w:t>
-          </w:r>
-          <w:r>
-            <w:rPr>
-              <w:rFonts w:ascii="Times New Roman" w:hAnsi="Times New Roman" w:cs="Times New Roman"/>
-              <w:sz w:val="23"/>
-            </w:rPr>
-            <w:tab/>
-          </w:r>
-          <w:r>
-            <w:rPr>
-              <w:rFonts w:ascii="Times New Roman" w:hAnsi="Times New Roman" w:cs="Times New Roman"/>
-              <w:sz w:val="23"/>
-            </w:rPr>
-            <w:t>25</w:t>
-          </w:r>
-        </w:p>
-        <w:p>
-          <w:pPr>
-            <w:pStyle w:val="TOC2"/>
-            <w:tabs>
-              <w:tab w:val="right" w:leader="dot" w:pos="9070"/>
-            </w:tabs>
-            <w:ind w:left="360"/>
-            <w:spacing w:before="24" w:after="24" w:line="240" w:lineRule="auto"/>
-          </w:pPr>
-          <w:r>
-            <w:rPr>
-              <w:rFonts w:ascii="Times New Roman" w:hAnsi="Times New Roman" w:cs="Times New Roman"/>
-              <w:sz w:val="23"/>
-            </w:rPr>
-            <w:t>4.3. Mô-đun Phân loại phán quyết hai bước (Two-step Verdict Classification - TVC)</w:t>
-          </w:r>
-          <w:r>
-            <w:rPr>
-              <w:rFonts w:ascii="Times New Roman" w:hAnsi="Times New Roman" w:cs="Times New Roman"/>
-              <w:sz w:val="23"/>
-            </w:rPr>
-            <w:tab/>
-          </w:r>
-          <w:r>
-            <w:rPr>
-              <w:rFonts w:ascii="Times New Roman" w:hAnsi="Times New Roman" w:cs="Times New Roman"/>
-              <w:sz w:val="23"/>
-            </w:rPr>
-            <w:t>26</w:t>
-          </w:r>
-        </w:p>
-        <w:p>
-          <w:pPr>
-            <w:pStyle w:val="TOC3"/>
-            <w:tabs>
-              <w:tab w:val="right" w:leader="dot" w:pos="9070"/>
-            </w:tabs>
-            <w:ind w:left="720"/>
-            <w:spacing w:before="24" w:after="24" w:line="240" w:lineRule="auto"/>
-          </w:pPr>
-          <w:r>
-            <w:rPr>
-              <w:rFonts w:ascii="Times New Roman" w:hAnsi="Times New Roman" w:cs="Times New Roman"/>
-              <w:sz w:val="23"/>
-            </w:rPr>
-            <w:t>4.3.1. Phân tích nguyên nhân thất bại phân loại 3 nhãn trực tiếp</w:t>
-          </w:r>
-          <w:r>
-            <w:rPr>
-              <w:rFonts w:ascii="Times New Roman" w:hAnsi="Times New Roman" w:cs="Times New Roman"/>
-              <w:sz w:val="23"/>
-            </w:rPr>
-            <w:tab/>
-          </w:r>
-          <w:r>
-            <w:rPr>
-              <w:rFonts w:ascii="Times New Roman" w:hAnsi="Times New Roman" w:cs="Times New Roman"/>
-              <w:sz w:val="23"/>
-            </w:rPr>
-            <w:t>26</w:t>
-          </w:r>
-        </w:p>
-        <w:p>
-          <w:pPr>
-            <w:pStyle w:val="TOC3"/>
-            <w:tabs>
-              <w:tab w:val="right" w:leader="dot" w:pos="9070"/>
-            </w:tabs>
-            <w:ind w:left="720"/>
-            <w:spacing w:before="24" w:after="24" w:line="240" w:lineRule="auto"/>
-          </w:pPr>
-          <w:r>
-            <w:rPr>
-              <w:rFonts w:ascii="Times New Roman" w:hAnsi="Times New Roman" w:cs="Times New Roman"/>
-              <w:sz w:val="23"/>
-            </w:rPr>
-            <w:t>4.3.2. Bước 1: Bộ lọc tính đầy đủ (Sufficiency Filter)</w:t>
-          </w:r>
-          <w:r>
-            <w:rPr>
-              <w:rFonts w:ascii="Times New Roman" w:hAnsi="Times New Roman" w:cs="Times New Roman"/>
-              <w:sz w:val="23"/>
-            </w:rPr>
-            <w:tab/>
-          </w:r>
-          <w:r>
-            <w:rPr>
-              <w:rFonts w:ascii="Times New Roman" w:hAnsi="Times New Roman" w:cs="Times New Roman"/>
-              <w:sz w:val="23"/>
-            </w:rPr>
-            <w:t>26</w:t>
-          </w:r>
-        </w:p>
-        <w:p>
-          <w:pPr>
-            <w:pStyle w:val="TOC3"/>
-            <w:tabs>
-              <w:tab w:val="right" w:leader="dot" w:pos="9070"/>
-            </w:tabs>
-            <w:ind w:left="720"/>
-            <w:spacing w:before="24" w:after="24" w:line="240" w:lineRule="auto"/>
-          </w:pPr>
-          <w:r>
-            <w:rPr>
-              <w:rFonts w:ascii="Times New Roman" w:hAnsi="Times New Roman" w:cs="Times New Roman"/>
-              <w:sz w:val="23"/>
-            </w:rPr>
-            <w:t>4.3.3. Bước 2: Xác minh lập trường (Stance Verification)</w:t>
-          </w:r>
-          <w:r>
-            <w:rPr>
-              <w:rFonts w:ascii="Times New Roman" w:hAnsi="Times New Roman" w:cs="Times New Roman"/>
-              <w:sz w:val="23"/>
-            </w:rPr>
-            <w:tab/>
-          </w:r>
-          <w:r>
-            <w:rPr>
-              <w:rFonts w:ascii="Times New Roman" w:hAnsi="Times New Roman" w:cs="Times New Roman"/>
-              <w:sz w:val="23"/>
-            </w:rPr>
-            <w:t>27</w:t>
-          </w:r>
-        </w:p>
-        <w:p>
-          <w:pPr>
-            <w:pStyle w:val="TOC3"/>
-            <w:tabs>
-              <w:tab w:val="right" w:leader="dot" w:pos="9070"/>
-            </w:tabs>
-            <w:ind w:left="720"/>
-            <w:spacing w:before="24" w:after="24" w:line="240" w:lineRule="auto"/>
-          </w:pPr>
-          <w:r>
-            <w:rPr>
-              <w:rFonts w:ascii="Times New Roman" w:hAnsi="Times New Roman" w:cs="Times New Roman"/>
-              <w:sz w:val="23"/>
-            </w:rPr>
-            <w:t>4.3.4. Thiết kế kỹ nghệ Prompting Few-shot tiếng Việt</w:t>
-          </w:r>
-          <w:r>
-            <w:rPr>
-              <w:rFonts w:ascii="Times New Roman" w:hAnsi="Times New Roman" w:cs="Times New Roman"/>
-              <w:sz w:val="23"/>
-            </w:rPr>
-            <w:tab/>
-          </w:r>
-          <w:r>
-            <w:rPr>
-              <w:rFonts w:ascii="Times New Roman" w:hAnsi="Times New Roman" w:cs="Times New Roman"/>
-              <w:sz w:val="23"/>
-            </w:rPr>
-            <w:t>27</w:t>
-          </w:r>
-        </w:p>
-        <w:p>
-          <w:pPr>
-            <w:pStyle w:val="TOC2"/>
-            <w:tabs>
-              <w:tab w:val="right" w:leader="dot" w:pos="9070"/>
-            </w:tabs>
-            <w:ind w:left="360"/>
-            <w:spacing w:before="24" w:after="24" w:line="240" w:lineRule="auto"/>
-          </w:pPr>
-          <w:r>
-            <w:rPr>
-              <w:rFonts w:ascii="Times New Roman" w:hAnsi="Times New Roman" w:cs="Times New Roman"/>
-              <w:sz w:val="23"/>
-            </w:rPr>
-            <w:t>4.4. Mô-đun RAG Rationale Generation và Trích xuất có cấu trúc (Pydantic)</w:t>
-          </w:r>
-          <w:r>
-            <w:rPr>
-              <w:rFonts w:ascii="Times New Roman" w:hAnsi="Times New Roman" w:cs="Times New Roman"/>
-              <w:sz w:val="23"/>
-            </w:rPr>
-            <w:tab/>
-          </w:r>
-          <w:r>
-            <w:rPr>
-              <w:rFonts w:ascii="Times New Roman" w:hAnsi="Times New Roman" w:cs="Times New Roman"/>
-              <w:sz w:val="23"/>
-            </w:rPr>
-            <w:t>28</w:t>
-          </w:r>
-        </w:p>
-        <w:p>
-          <w:pPr>
-            <w:pStyle w:val="TOC1"/>
-            <w:tabs>
-              <w:tab w:val="right" w:leader="dot" w:pos="9070"/>
-            </w:tabs>
-            <w:ind w:left="0"/>
-            <w:spacing w:before="24" w:after="24" w:line="240" w:lineRule="auto"/>
-          </w:pPr>
-          <w:r>
-            <w:rPr>
-              <w:rFonts w:ascii="Times New Roman" w:hAnsi="Times New Roman" w:cs="Times New Roman"/>
-              <w:b/>
-              <w:sz w:val="24"/>
-            </w:rPr>
-            <w:t>CHƯƠNG 5: KẾT QUẢ THỰC NGHIỆM VÀ ĐÁNH GIÁ</w:t>
-          </w:r>
-          <w:r>
-            <w:rPr>
-              <w:rFonts w:ascii="Times New Roman" w:hAnsi="Times New Roman" w:cs="Times New Roman"/>
-              <w:sz w:val="24"/>
-            </w:rPr>
-            <w:tab/>
-          </w:r>
-          <w:r>
-            <w:rPr>
-              <w:rFonts w:ascii="Times New Roman" w:hAnsi="Times New Roman" w:cs="Times New Roman"/>
-              <w:b/>
-              <w:sz w:val="24"/>
-            </w:rPr>
-            <w:t>30</w:t>
-          </w:r>
-        </w:p>
-        <w:p>
-          <w:pPr>
-            <w:pStyle w:val="TOC2"/>
-            <w:tabs>
-              <w:tab w:val="right" w:leader="dot" w:pos="9070"/>
-            </w:tabs>
-            <w:ind w:left="360"/>
-            <w:spacing w:before="24" w:after="24" w:line="240" w:lineRule="auto"/>
-          </w:pPr>
-          <w:r>
-            <w:rPr>
-              <w:rFonts w:ascii="Times New Roman" w:hAnsi="Times New Roman" w:cs="Times New Roman"/>
-              <w:sz w:val="23"/>
-            </w:rPr>
-            <w:t>5.1. Thiết lập thực nghiệm và Siêu tham số</w:t>
-          </w:r>
-          <w:r>
-            <w:rPr>
-              <w:rFonts w:ascii="Times New Roman" w:hAnsi="Times New Roman" w:cs="Times New Roman"/>
-              <w:sz w:val="23"/>
-            </w:rPr>
-            <w:tab/>
-          </w:r>
-          <w:r>
-            <w:rPr>
-              <w:rFonts w:ascii="Times New Roman" w:hAnsi="Times New Roman" w:cs="Times New Roman"/>
-              <w:sz w:val="23"/>
-            </w:rPr>
-            <w:t>30</w:t>
-          </w:r>
-        </w:p>
-        <w:p>
-          <w:pPr>
-            <w:pStyle w:val="TOC2"/>
-            <w:tabs>
-              <w:tab w:val="right" w:leader="dot" w:pos="9070"/>
-            </w:tabs>
-            <w:ind w:left="360"/>
-            <w:spacing w:before="24" w:after="24" w:line="240" w:lineRule="auto"/>
-          </w:pPr>
-          <w:r>
-            <w:rPr>
-              <w:rFonts w:ascii="Times New Roman" w:hAnsi="Times New Roman" w:cs="Times New Roman"/>
-              <w:sz w:val="23"/>
-            </w:rPr>
-            <w:t>5.2. Kết quả đánh giá mô-đun Truy xuất bằng chứng (SER)</w:t>
-          </w:r>
-          <w:r>
-            <w:rPr>
-              <w:rFonts w:ascii="Times New Roman" w:hAnsi="Times New Roman" w:cs="Times New Roman"/>
-              <w:sz w:val="23"/>
-            </w:rPr>
-            <w:tab/>
-          </w:r>
-          <w:r>
-            <w:rPr>
-              <w:rFonts w:ascii="Times New Roman" w:hAnsi="Times New Roman" w:cs="Times New Roman"/>
-              <w:sz w:val="23"/>
-            </w:rPr>
-            <w:t>31</w:t>
-          </w:r>
-        </w:p>
-        <w:p>
-          <w:pPr>
-            <w:pStyle w:val="TOC2"/>
-            <w:tabs>
-              <w:tab w:val="right" w:leader="dot" w:pos="9070"/>
-            </w:tabs>
-            <w:ind w:left="360"/>
-            <w:spacing w:before="24" w:after="24" w:line="240" w:lineRule="auto"/>
-          </w:pPr>
-          <w:r>
-            <w:rPr>
-              <w:rFonts w:ascii="Times New Roman" w:hAnsi="Times New Roman" w:cs="Times New Roman"/>
-              <w:sz w:val="23"/>
-            </w:rPr>
-            <w:t>5.3. Kết quả đánh giá mô-đun Phân loại phán quyết (TVC)</w:t>
-          </w:r>
-          <w:r>
-            <w:rPr>
-              <w:rFonts w:ascii="Times New Roman" w:hAnsi="Times New Roman" w:cs="Times New Roman"/>
-              <w:sz w:val="23"/>
-            </w:rPr>
-            <w:tab/>
-          </w:r>
-          <w:r>
-            <w:rPr>
-              <w:rFonts w:ascii="Times New Roman" w:hAnsi="Times New Roman" w:cs="Times New Roman"/>
-              <w:sz w:val="23"/>
-            </w:rPr>
-            <w:t>32</w:t>
-          </w:r>
-        </w:p>
-        <w:p>
-          <w:pPr>
-            <w:pStyle w:val="TOC2"/>
-            <w:tabs>
-              <w:tab w:val="right" w:leader="dot" w:pos="9070"/>
-            </w:tabs>
-            <w:ind w:left="360"/>
-            <w:spacing w:before="24" w:after="24" w:line="240" w:lineRule="auto"/>
-          </w:pPr>
-          <w:r>
-            <w:rPr>
-              <w:rFonts w:ascii="Times New Roman" w:hAnsi="Times New Roman" w:cs="Times New Roman"/>
-              <w:sz w:val="23"/>
-            </w:rPr>
-            <w:t>5.4. Nghiên cứu thành phần (Ablation Study)</w:t>
-          </w:r>
-          <w:r>
-            <w:rPr>
-              <w:rFonts w:ascii="Times New Roman" w:hAnsi="Times New Roman" w:cs="Times New Roman"/>
-              <w:sz w:val="23"/>
-            </w:rPr>
-            <w:tab/>
-          </w:r>
-          <w:r>
-            <w:rPr>
-              <w:rFonts w:ascii="Times New Roman" w:hAnsi="Times New Roman" w:cs="Times New Roman"/>
-              <w:sz w:val="23"/>
-            </w:rPr>
-            <w:t>33</w:t>
-          </w:r>
-        </w:p>
-        <w:p>
-          <w:pPr>
-            <w:pStyle w:val="TOC2"/>
-            <w:tabs>
-              <w:tab w:val="right" w:leader="dot" w:pos="9070"/>
-            </w:tabs>
-            <w:ind w:left="360"/>
-            <w:spacing w:before="24" w:after="24" w:line="240" w:lineRule="auto"/>
-          </w:pPr>
-          <w:r>
-            <w:rPr>
-              <w:rFonts w:ascii="Times New Roman" w:hAnsi="Times New Roman" w:cs="Times New Roman"/>
-              <w:sz w:val="23"/>
-            </w:rPr>
-            <w:t>5.5. So sánh hiệu quả các chiến lược kỹ nghệ Prompting</w:t>
-          </w:r>
-          <w:r>
-            <w:rPr>
-              <w:rFonts w:ascii="Times New Roman" w:hAnsi="Times New Roman" w:cs="Times New Roman"/>
-              <w:sz w:val="23"/>
-            </w:rPr>
-            <w:tab/>
-          </w:r>
-          <w:r>
-            <w:rPr>
-              <w:rFonts w:ascii="Times New Roman" w:hAnsi="Times New Roman" w:cs="Times New Roman"/>
-              <w:sz w:val="23"/>
-            </w:rPr>
-            <w:t>34</w:t>
-          </w:r>
-        </w:p>
-        <w:p>
-          <w:pPr>
-            <w:pStyle w:val="TOC2"/>
-            <w:tabs>
-              <w:tab w:val="right" w:leader="dot" w:pos="9070"/>
-            </w:tabs>
-            <w:ind w:left="360"/>
-            <w:spacing w:before="24" w:after="24" w:line="240" w:lineRule="auto"/>
-          </w:pPr>
-          <w:r>
-            <w:rPr>
-              <w:rFonts w:ascii="Times New Roman" w:hAnsi="Times New Roman" w:cs="Times New Roman"/>
-              <w:sz w:val="23"/>
-            </w:rPr>
-            <w:t>5.6. Phân tích định tính và Nghiên cứu trường hợp điển hình (Case Studies)</w:t>
-          </w:r>
-          <w:r>
-            <w:rPr>
-              <w:rFonts w:ascii="Times New Roman" w:hAnsi="Times New Roman" w:cs="Times New Roman"/>
-              <w:sz w:val="23"/>
-            </w:rPr>
-            <w:tab/>
-          </w:r>
-          <w:r>
-            <w:rPr>
-              <w:rFonts w:ascii="Times New Roman" w:hAnsi="Times New Roman" w:cs="Times New Roman"/>
-              <w:sz w:val="23"/>
-            </w:rPr>
-            <w:t>35</w:t>
-          </w:r>
-        </w:p>
-        <w:p>
-          <w:pPr>
-            <w:pStyle w:val="TOC3"/>
-            <w:tabs>
-              <w:tab w:val="right" w:leader="dot" w:pos="9070"/>
-            </w:tabs>
-            <w:ind w:left="720"/>
-            <w:spacing w:before="24" w:after="24" w:line="240" w:lineRule="auto"/>
-          </w:pPr>
-          <w:r>
-            <w:rPr>
-              <w:rFonts w:ascii="Times New Roman" w:hAnsi="Times New Roman" w:cs="Times New Roman"/>
-              <w:sz w:val="23"/>
-            </w:rPr>
-            <w:t>5.6.1. Ca 1: Phán quyết SUPPORTED (Kiểm chứng tri thức bách khoa)</w:t>
-          </w:r>
-          <w:r>
-            <w:rPr>
-              <w:rFonts w:ascii="Times New Roman" w:hAnsi="Times New Roman" w:cs="Times New Roman"/>
-              <w:sz w:val="23"/>
-            </w:rPr>
-            <w:tab/>
-          </w:r>
-          <w:r>
-            <w:rPr>
-              <w:rFonts w:ascii="Times New Roman" w:hAnsi="Times New Roman" w:cs="Times New Roman"/>
-              <w:sz w:val="23"/>
-            </w:rPr>
-            <w:t>35</w:t>
-          </w:r>
-        </w:p>
-        <w:p>
-          <w:pPr>
-            <w:pStyle w:val="TOC3"/>
-            <w:tabs>
-              <w:tab w:val="right" w:leader="dot" w:pos="9070"/>
-            </w:tabs>
-            <w:ind w:left="720"/>
-            <w:spacing w:before="24" w:after="24" w:line="240" w:lineRule="auto"/>
-          </w:pPr>
-          <w:r>
-            <w:rPr>
-              <w:rFonts w:ascii="Times New Roman" w:hAnsi="Times New Roman" w:cs="Times New Roman"/>
-              <w:sz w:val="23"/>
-            </w:rPr>
-            <w:t>5.6.2. Ca 2: Phán quyết REFUTED (Phát hiện tin xuyên tạc sự thật)</w:t>
-          </w:r>
-          <w:r>
-            <w:rPr>
-              <w:rFonts w:ascii="Times New Roman" w:hAnsi="Times New Roman" w:cs="Times New Roman"/>
-              <w:sz w:val="23"/>
-            </w:rPr>
-            <w:tab/>
-          </w:r>
-          <w:r>
-            <w:rPr>
-              <w:rFonts w:ascii="Times New Roman" w:hAnsi="Times New Roman" w:cs="Times New Roman"/>
-              <w:sz w:val="23"/>
-            </w:rPr>
-            <w:t>35</w:t>
-          </w:r>
-        </w:p>
-        <w:p>
-          <w:pPr>
-            <w:pStyle w:val="TOC3"/>
-            <w:tabs>
-              <w:tab w:val="right" w:leader="dot" w:pos="9070"/>
-            </w:tabs>
-            <w:ind w:left="720"/>
-            <w:spacing w:before="24" w:after="24" w:line="240" w:lineRule="auto"/>
-          </w:pPr>
-          <w:r>
-            <w:rPr>
-              <w:rFonts w:ascii="Times New Roman" w:hAnsi="Times New Roman" w:cs="Times New Roman"/>
-              <w:sz w:val="23"/>
-            </w:rPr>
-            <w:t>5.6.3. Ca 3: Phán quyết NOT ENOUGH INFO (Lọc thiếu căn cứ)</w:t>
-          </w:r>
-          <w:r>
-            <w:rPr>
-              <w:rFonts w:ascii="Times New Roman" w:hAnsi="Times New Roman" w:cs="Times New Roman"/>
-              <w:sz w:val="23"/>
-            </w:rPr>
-            <w:tab/>
-          </w:r>
-          <w:r>
-            <w:rPr>
-              <w:rFonts w:ascii="Times New Roman" w:hAnsi="Times New Roman" w:cs="Times New Roman"/>
-              <w:sz w:val="23"/>
-            </w:rPr>
-            <w:t>36</w:t>
-          </w:r>
-        </w:p>
-        <w:p>
-          <w:pPr>
-            <w:pStyle w:val="TOC3"/>
-            <w:tabs>
-              <w:tab w:val="right" w:leader="dot" w:pos="9070"/>
-            </w:tabs>
-            <w:ind w:left="720"/>
-            <w:spacing w:before="24" w:after="24" w:line="240" w:lineRule="auto"/>
-          </w:pPr>
-          <w:r>
-            <w:rPr>
-              <w:rFonts w:ascii="Times New Roman" w:hAnsi="Times New Roman" w:cs="Times New Roman"/>
-              <w:sz w:val="23"/>
-            </w:rPr>
-            <w:t>5.6.4. Ca 4: Phân tích sai sót (Error Analysis)</w:t>
-          </w:r>
-          <w:r>
-            <w:rPr>
-              <w:rFonts w:ascii="Times New Roman" w:hAnsi="Times New Roman" w:cs="Times New Roman"/>
-              <w:sz w:val="23"/>
-            </w:rPr>
-            <w:tab/>
-          </w:r>
-          <w:r>
-            <w:rPr>
-              <w:rFonts w:ascii="Times New Roman" w:hAnsi="Times New Roman" w:cs="Times New Roman"/>
-              <w:sz w:val="23"/>
-            </w:rPr>
-            <w:t>36</w:t>
-          </w:r>
-        </w:p>
-        <w:p>
-          <w:pPr>
-            <w:pStyle w:val="TOC1"/>
-            <w:tabs>
-              <w:tab w:val="right" w:leader="dot" w:pos="9070"/>
-            </w:tabs>
-            <w:ind w:left="0"/>
-            <w:spacing w:before="24" w:after="24" w:line="240" w:lineRule="auto"/>
-          </w:pPr>
-          <w:r>
-            <w:rPr>
-              <w:rFonts w:ascii="Times New Roman" w:hAnsi="Times New Roman" w:cs="Times New Roman"/>
-              <w:b/>
-              <w:sz w:val="24"/>
-            </w:rPr>
-            <w:t>CHƯƠNG 6: KẾT LUẬN VÀ HƯỚNG PHÁT TRIỂN</w:t>
-          </w:r>
-          <w:r>
-            <w:rPr>
-              <w:rFonts w:ascii="Times New Roman" w:hAnsi="Times New Roman" w:cs="Times New Roman"/>
-              <w:sz w:val="24"/>
-            </w:rPr>
-            <w:tab/>
-          </w:r>
-          <w:r>
-            <w:rPr>
-              <w:rFonts w:ascii="Times New Roman" w:hAnsi="Times New Roman" w:cs="Times New Roman"/>
-              <w:b/>
-              <w:sz w:val="24"/>
-            </w:rPr>
-            <w:t>38</w:t>
-          </w:r>
-        </w:p>
-        <w:p>
-          <w:pPr>
-            <w:pStyle w:val="TOC2"/>
-            <w:tabs>
-              <w:tab w:val="right" w:leader="dot" w:pos="9070"/>
-            </w:tabs>
-            <w:ind w:left="360"/>
-            <w:spacing w:before="24" w:after="24" w:line="240" w:lineRule="auto"/>
-          </w:pPr>
-          <w:r>
-            <w:rPr>
-              <w:rFonts w:ascii="Times New Roman" w:hAnsi="Times New Roman" w:cs="Times New Roman"/>
-              <w:sz w:val="23"/>
-            </w:rPr>
-            <w:t>6.1. Kết luận</w:t>
-          </w:r>
-          <w:r>
-            <w:rPr>
-              <w:rFonts w:ascii="Times New Roman" w:hAnsi="Times New Roman" w:cs="Times New Roman"/>
-              <w:sz w:val="23"/>
-            </w:rPr>
-            <w:tab/>
-          </w:r>
-          <w:r>
-            <w:rPr>
-              <w:rFonts w:ascii="Times New Roman" w:hAnsi="Times New Roman" w:cs="Times New Roman"/>
-              <w:sz w:val="23"/>
-            </w:rPr>
-            <w:t>38</w:t>
-          </w:r>
-        </w:p>
-        <w:p>
-          <w:pPr>
-            <w:pStyle w:val="TOC2"/>
-            <w:tabs>
-              <w:tab w:val="right" w:leader="dot" w:pos="9070"/>
-            </w:tabs>
-            <w:ind w:left="360"/>
-            <w:spacing w:before="24" w:after="24" w:line="240" w:lineRule="auto"/>
-          </w:pPr>
-          <w:r>
-            <w:rPr>
-              <w:rFonts w:ascii="Times New Roman" w:hAnsi="Times New Roman" w:cs="Times New Roman"/>
-              <w:sz w:val="23"/>
-            </w:rPr>
-            <w:t>6.2. Hạn chế</w:t>
-          </w:r>
-          <w:r>
-            <w:rPr>
-              <w:rFonts w:ascii="Times New Roman" w:hAnsi="Times New Roman" w:cs="Times New Roman"/>
-              <w:sz w:val="23"/>
-            </w:rPr>
-            <w:tab/>
-          </w:r>
-          <w:r>
-            <w:rPr>
-              <w:rFonts w:ascii="Times New Roman" w:hAnsi="Times New Roman" w:cs="Times New Roman"/>
-              <w:sz w:val="23"/>
-            </w:rPr>
-            <w:t>38</w:t>
-          </w:r>
-        </w:p>
-        <w:p>
-          <w:pPr>
-            <w:pStyle w:val="TOC2"/>
-            <w:tabs>
-              <w:tab w:val="right" w:leader="dot" w:pos="9070"/>
-            </w:tabs>
-            <w:ind w:left="360"/>
-            <w:spacing w:before="24" w:after="24" w:line="240" w:lineRule="auto"/>
-          </w:pPr>
-          <w:r>
-            <w:rPr>
-              <w:rFonts w:ascii="Times New Roman" w:hAnsi="Times New Roman" w:cs="Times New Roman"/>
-              <w:sz w:val="23"/>
-            </w:rPr>
-            <w:t>6.3. Hướng phát triển trong tương lai</w:t>
-          </w:r>
-          <w:r>
-            <w:rPr>
-              <w:rFonts w:ascii="Times New Roman" w:hAnsi="Times New Roman" w:cs="Times New Roman"/>
-              <w:sz w:val="23"/>
-            </w:rPr>
-            <w:tab/>
-          </w:r>
-          <w:r>
-            <w:rPr>
-              <w:rFonts w:ascii="Times New Roman" w:hAnsi="Times New Roman" w:cs="Times New Roman"/>
-              <w:sz w:val="23"/>
-            </w:rPr>
-            <w:t>39</w:t>
-          </w:r>
-        </w:p>
-        <w:p>
-          <w:pPr>
-            <w:pStyle w:val="TOC1"/>
-            <w:tabs>
-              <w:tab w:val="right" w:leader="dot" w:pos="9070"/>
-            </w:tabs>
-            <w:ind w:left="0"/>
-            <w:spacing w:before="24" w:after="24" w:line="240" w:lineRule="auto"/>
-          </w:pPr>
-          <w:r>
-            <w:rPr>
-              <w:rFonts w:ascii="Times New Roman" w:hAnsi="Times New Roman" w:cs="Times New Roman"/>
-              <w:b/>
-              <w:sz w:val="24"/>
-            </w:rPr>
-            <w:t>TÀI LIỆU THAM KHẢO</w:t>
-          </w:r>
-          <w:r>
-            <w:rPr>
-              <w:rFonts w:ascii="Times New Roman" w:hAnsi="Times New Roman" w:cs="Times New Roman"/>
-              <w:sz w:val="24"/>
-            </w:rPr>
-            <w:tab/>
-          </w:r>
-          <w:r>
-            <w:rPr>
-              <w:rFonts w:ascii="Times New Roman" w:hAnsi="Times New Roman" w:cs="Times New Roman"/>
-              <w:b/>
-              <w:sz w:val="24"/>
-            </w:rPr>
-            <w:t>40</w:t>
-          </w:r>
-        </w:p>
-        <w:p>
-          <w:pPr>
-            <w:pStyle w:val="TOC1"/>
-            <w:tabs>
-              <w:tab w:val="right" w:leader="dot" w:pos="9070"/>
-            </w:tabs>
-            <w:ind w:left="0"/>
-            <w:spacing w:before="24" w:after="24" w:line="240" w:lineRule="auto"/>
-          </w:pPr>
-          <w:r>
-            <w:rPr>
-              <w:rFonts w:ascii="Times New Roman" w:hAnsi="Times New Roman" w:cs="Times New Roman"/>
-              <w:b/>
-              <w:sz w:val="24"/>
-            </w:rPr>
-            <w:t>PHỤ LỤC</w:t>
-          </w:r>
-          <w:r>
-            <w:rPr>
-              <w:rFonts w:ascii="Times New Roman" w:hAnsi="Times New Roman" w:cs="Times New Roman"/>
-              <w:sz w:val="24"/>
-            </w:rPr>
-            <w:tab/>
-          </w:r>
-          <w:r>
-            <w:rPr>
-              <w:rFonts w:ascii="Times New Roman" w:hAnsi="Times New Roman" w:cs="Times New Roman"/>
-              <w:b/>
-              <w:sz w:val="24"/>
-            </w:rPr>
-            <w:t>42</w:t>
-          </w:r>
-        </w:p>
-        <w:p>
-          <w:r>
-            <w:fldChar w:fldCharType="end"/>
-          </w:r>
-        </w:p>
-      </w:sdtContent>
-    </w:sdt>
   </w:body>
 </w:document>
 </file>

</xml_diff>